<commit_message>
Tarea 2: regenera el informe Word con identificadores de texto
Co-Authored-By: Claude Sonnet 5.5 <noreply@anthropic.com>
Claude-Session: https://claude.ai/code/session_016S2e3FucHCtgupXcPL28A1
</commit_message>
<xml_diff>
--- a/Seguridad de Aplicaciones/Tarea 2/Informe-Tarea2-ParaBank.docx
+++ b/Seguridad de Aplicaciones/Tarea 2/Informe-Tarea2-ParaBank.docx
@@ -2984,7 +2984,7 @@
                 <w:szCs w:val="18"/>
                 <w:lang w:val="es-GT"/>
               </w:rPr>
-              <w:t xml:space="preserve">Páginas *.htm; usa LoginInterceptor para las páginas protegidas.</w:t>
+              <w:t xml:space="preserve">Páginas *.htm; usa LoginInterceptor para las páginas protegidas</w:t>
             </w:r>
           </w:p>
         </w:tc>
@@ -3099,7 +3099,7 @@
                 <w:szCs w:val="18"/>
                 <w:lang w:val="es-GT"/>
               </w:rPr>
-              <w:t xml:space="preserve">Endpoints /services/* (JAX-WS y JAX-RS) y /services_proxy/*.</w:t>
+              <w:t xml:space="preserve">Endpoints /services/* (JAX-WS y JAX-RS) y /services_proxy/*</w:t>
             </w:r>
           </w:p>
         </w:tc>
@@ -3214,7 +3214,7 @@
                 <w:szCs w:val="18"/>
                 <w:lang w:val="es-GT"/>
               </w:rPr>
-              <w:t xml:space="preserve">BankManager, AdminManager y capa DAO JDBC.</w:t>
+              <w:t xml:space="preserve">BankManager, AdminManager y capa DAO JDBC</w:t>
             </w:r>
           </w:p>
         </w:tc>
@@ -3329,7 +3329,7 @@
                 <w:szCs w:val="18"/>
                 <w:lang w:val="es-GT"/>
               </w:rPr>
-              <w:t xml:space="preserve">LoanProcessor con umbral configurable y listener JMS.</w:t>
+              <w:t xml:space="preserve">LoanProcessor con umbral configurable y listener JMS</w:t>
             </w:r>
           </w:p>
         </w:tc>
@@ -3444,7 +3444,7 @@
                 <w:szCs w:val="18"/>
                 <w:lang w:val="es-GT"/>
               </w:rPr>
-              <w:t xml:space="preserve">admin.htm, db.htm, initializeDB.htm, jms.htm y operaciones de mantenimiento.</w:t>
+              <w:t xml:space="preserve">admin.htm, db.htm, initializeDB.htm, jms.htm y operaciones de mantenimiento</w:t>
             </w:r>
           </w:p>
         </w:tc>
@@ -3559,7 +3559,7 @@
                 <w:szCs w:val="18"/>
                 <w:lang w:val="es-GT"/>
               </w:rPr>
-              <w:t xml:space="preserve">Tablas Customer, Account, Transaction, Positions, Parameter, News.</w:t>
+              <w:t xml:space="preserve">Tablas Customer, Account, Transaction, Positions, Parameter, News</w:t>
             </w:r>
           </w:p>
         </w:tc>
@@ -3674,7 +3674,7 @@
                 <w:szCs w:val="18"/>
                 <w:lang w:val="es-GT"/>
               </w:rPr>
-              <w:t xml:space="preserve">Colas de solicitud y respuesta de préstamos.</w:t>
+              <w:t xml:space="preserve">Colas de solicitud y respuesta de préstamos</w:t>
             </w:r>
           </w:p>
         </w:tc>
@@ -3789,7 +3789,7 @@
                 <w:szCs w:val="18"/>
                 <w:lang w:val="es-GT"/>
               </w:rPr>
-              <w:t xml:space="preserve">Registros de la aplicación.</w:t>
+              <w:t xml:space="preserve">Registros de la aplicación</w:t>
             </w:r>
           </w:p>
         </w:tc>
@@ -3904,7 +3904,7 @@
                 <w:szCs w:val="18"/>
                 <w:lang w:val="es-GT"/>
               </w:rPr>
-              <w:t xml:space="preserve">Usuario final que opera su banca en línea desde un navegador.</w:t>
+              <w:t xml:space="preserve">Usuario final que opera su banca en línea desde un navegador</w:t>
             </w:r>
           </w:p>
         </w:tc>
@@ -4019,7 +4019,7 @@
                 <w:szCs w:val="18"/>
                 <w:lang w:val="es-GT"/>
               </w:rPr>
-              <w:t xml:space="preserve">Persona que configura la demo: parámetros, base de datos, JMS.</w:t>
+              <w:t xml:space="preserve">Persona que configura la demo: parámetros, base de datos, JMS</w:t>
             </w:r>
           </w:p>
         </w:tc>
@@ -4134,7 +4134,7 @@
                 <w:szCs w:val="18"/>
                 <w:lang w:val="es-GT"/>
               </w:rPr>
-              <w:t xml:space="preserve">Aplicación externa que consume los servicios SOAP/REST.</w:t>
+              <w:t xml:space="preserve">Aplicación externa que consume los servicios SOAP/REST</w:t>
             </w:r>
           </w:p>
         </w:tc>
@@ -4261,7 +4261,7 @@
                 <w:szCs w:val="18"/>
                 <w:lang w:val="es-GT"/>
               </w:rPr>
-              <w:t xml:space="preserve">Sistema que aprueba o rechaza solicitudes de préstamo (WS/JMS).</w:t>
+              <w:t xml:space="preserve">Sistema que aprueba o rechaza solicitudes de préstamo (WS/JMS)</w:t>
             </w:r>
           </w:p>
         </w:tc>
@@ -11624,7 +11624,7 @@
                 <w:szCs w:val="16"/>
                 <w:lang w:val="es-GT"/>
               </w:rPr>
-              <w:t xml:space="preserve">El DAO arma el UPDATE concatenando customer.getFirstName() dentro de la sentencia; el dato cruza TB1 por POST /customers/update/{id} y llega sin parametrizar al motor HyperSQL (F06/G07). Un atacante puede cerrar la cadena e inyectar SQL que altere o exponga filas de Customer. Evidencia: Confirmado en código (JdbcCustomerDao.updateCustomer; el propio comentario indica que el fallo es intencional). Existe SecureJdbcCustomerDao con parámetros.</w:t>
+              <w:t xml:space="preserve">El DAO arma el UPDATE concatenando customer.getFirstName() dentro de la sentencia; el dato cruza TB1 por POST /customers/update/{id} y llega sin parametrizar al motor HyperSQL (F06/G07). Un atacante puede cerrar la cadena e inyectar SQL que altere o exponga filas de Customer. Evidencia: Confirmado en código (JdbcCustomerDao.updateCustomer; el propio comentario indica que el fallo es intencional). Existe SecureJdbcCustomerDao con parámetros</w:t>
             </w:r>
           </w:p>
         </w:tc>
@@ -11739,7 +11739,7 @@
                 <w:szCs w:val="16"/>
                 <w:lang w:val="es-GT"/>
               </w:rPr>
-              <w:t xml:space="preserve">El servicio REST recibe usuario y contraseña como segmentos de la ruta. Al cruzar TB1 quedan en el historial del navegador, en logs de Tomcat, proxies y cabeceras Referer, aun si el canal fuera cifrado. Evidencia: Confirmado en código (@Path("/login/{username}/{password}") en ParaBankService).</w:t>
+              <w:t xml:space="preserve">El servicio REST recibe usuario y contraseña como segmentos de la ruta. Al cruzar TB1 quedan en el historial del navegador, en logs de Tomcat, proxies y cabeceras Referer, aun si el canal fuera cifrado. Evidencia: Confirmado en código (@Path("/login/{username}/{password}") en ParaBankService)</w:t>
             </w:r>
           </w:p>
         </w:tc>
@@ -11854,7 +11854,7 @@
                 <w:szCs w:val="16"/>
                 <w:lang w:val="es-GT"/>
               </w:rPr>
-              <w:t xml:space="preserve">El mapeo protegido por LoginInterceptor solo cubre nueve páginas de cliente; admin.htm, db.htm, initializeDB.htm y jms.htm no figuran, por lo que cualquiera que llegue a Tomcat podría cambiar parámetros, reiniciar la BD o detener el listener JMS (F10, F11, F13). Evidencia: Confirmado en parabank-servlet.xml (secureHandlerMapping). A validar: que no exista otro filtro o regla de red.</w:t>
+              <w:t xml:space="preserve">El mapeo protegido por LoginInterceptor solo cubre nueve páginas de cliente; admin.htm, db.htm, initializeDB.htm y jms.htm no figuran, por lo que cualquiera que llegue a Tomcat podría cambiar parámetros, reiniciar la BD o detener el listener JMS (F10, F11, F13). Evidencia: Confirmado en parabank-servlet.xml (secureHandlerMapping). A validar: que no exista otro filtro o regla de red</w:t>
             </w:r>
           </w:p>
         </w:tc>
@@ -11969,7 +11969,7 @@
                 <w:szCs w:val="16"/>
                 <w:lang w:val="es-GT"/>
               </w:rPr>
-              <w:t xml:space="preserve">La interfaz de servicio publica operaciones destructivas y de configuración sin mecanismo de autenticación visible en la propia interfaz. Un cliente API externo que cruza TB1 puede borrar datos, reinicializar la BD o apagar la mensajería (F03, F05). Evidencia: Confirmado la exposición de rutas en ParaBankService. A validar: ausencia de control de acceso en la implementación.</w:t>
+              <w:t xml:space="preserve">La interfaz de servicio publica operaciones destructivas y de configuración sin mecanismo de autenticación visible en la propia interfaz. Un cliente API externo que cruza TB1 puede borrar datos, reinicializar la BD o apagar la mensajería (F03, F05). Evidencia: Confirmado la exposición de rutas en ParaBankService. A validar: ausencia de control de acceso en la implementación</w:t>
             </w:r>
           </w:p>
         </w:tc>
@@ -12084,7 +12084,7 @@
                 <w:szCs w:val="16"/>
                 <w:lang w:val="es-GT"/>
               </w:rPr>
-              <w:t xml:space="preserve">Rutas como /accounts/{accountId}, /customers/{customerId} y /transactions/{id} reciben identificadores secuenciales; la interfaz no muestra verificación de que el recurso pertenezca al llamante. Un atacante autenticado o anónimo puede enumerar identificadores y leer datos personales y financieros (F03, F05). Evidencia: Hipótesis a validar con pruebas autorizadas: la interfaz no muestra control de propiedad del recurso.</w:t>
+              <w:t xml:space="preserve">Rutas como /accounts/{accountId}, /customers/{customerId} y /transactions/{id} reciben identificadores secuenciales; la interfaz no muestra verificación de que el recurso pertenezca al llamante. Un atacante autenticado o anónimo puede enumerar identificadores y leer datos personales y financieros (F03, F05). Evidencia: Hipótesis a validar con pruebas autorizadas: la interfaz no muestra control de propiedad del recurso</w:t>
             </w:r>
           </w:p>
         </w:tc>
@@ -12199,7 +12199,7 @@
                 <w:szCs w:val="16"/>
                 <w:lang w:val="es-GT"/>
               </w:rPr>
-              <w:t xml:space="preserve">La tabla Customer guarda password y ssn y el login compara el valor directamente en SQL (username = ? AND password = ?), lo que implica almacenamiento en texto claro. Una lectura de la BD (por ejemplo vía T01 o por el puerto 9001) expone credenciales y datos de identidad (F06). Evidencia: Confirmado en código (JdbcCustomerDao: BASE_QUERY_SQL y consulta de login).</w:t>
+              <w:t xml:space="preserve">La tabla Customer guarda password y ssn y el login compara el valor directamente en SQL (username = ? AND password = ?), lo que implica almacenamiento en texto claro. Una lectura de la BD (por ejemplo vía T01 o por el puerto 9001) expone credenciales y datos de identidad (F06). Evidencia: Confirmado en código (JdbcCustomerDao: BASE_QUERY_SQL y consulta de login)</w:t>
             </w:r>
           </w:p>
         </w:tc>
@@ -12314,7 +12314,7 @@
                 <w:szCs w:val="16"/>
                 <w:lang w:val="es-GT"/>
               </w:rPr>
-              <w:t xml:space="preserve">jdbc.properties define jdbc.username=sa con contraseña vacía y el servidor HyperSQL escucha por TCP (9001). Cualquier host con alcance de red puede conectarse como administrador de la BD y saltar toda la lógica de la aplicación (F06, F11). Evidencia: Confirmado en jdbc.properties y README (puerto 9001).</w:t>
+              <w:t xml:space="preserve">jdbc.properties define jdbc.username=sa con contraseña vacía y el servidor HyperSQL escucha por TCP (9001). Cualquier host con alcance de red puede conectarse como administrador de la BD y saltar toda la lógica de la aplicación (F06, F11). Evidencia: Confirmado en jdbc.properties y README (puerto 9001)</w:t>
             </w:r>
           </w:p>
         </w:tc>
@@ -12429,7 +12429,7 @@
                 <w:szCs w:val="16"/>
                 <w:lang w:val="es-GT"/>
               </w:rPr>
-              <w:t xml:space="preserve">El broker se publica en todas las interfaces y la configuración no declara plugin de autenticación ni autorización. Un tercero puede inyectar o leer mensajes de solicitud y respuesta de préstamos que cruzan TB2 (F08). Evidencia: Confirmado en applicationContext-jms.xml (transportConnector tcp://0.0.0.0:61616; sin plugin de seguridad en ese bloque).</w:t>
+              <w:t xml:space="preserve">El broker se publica en todas las interfaces y la configuración no declara plugin de autenticación ni autorización. Un tercero puede inyectar o leer mensajes de solicitud y respuesta de préstamos que cruzan TB2 (F08). Evidencia: Confirmado en applicationContext-jms.xml (transportConnector tcp://0.0.0.0:61616; sin plugin de seguridad en ese bloque)</w:t>
             </w:r>
           </w:p>
         </w:tc>
@@ -12544,7 +12544,7 @@
                 <w:szCs w:val="16"/>
                 <w:lang w:val="es-GT"/>
               </w:rPr>
-              <w:t xml:space="preserve">El despliegue por defecto en Tomcat usa HTTP. Los flujos F01, F02, F03 y F10 cruzan la frontera de Internet con Provides Confidentiality = No e Integrity = No, de modo que un atacante en la ruta puede leer credenciales y cookie JSESSIONID o modificar montos. Evidencia: Supuesto de despliegue por defecto; depende de la instalación.</w:t>
+              <w:t xml:space="preserve">El despliegue por defecto en Tomcat usa HTTP. Los flujos F01, F02, F03 y F10 cruzan la frontera de Internet con Provides Confidentiality = No e Integrity = No, de modo que un atacante en la ruta puede leer credenciales y cookie JSESSIONID o modificar montos. Evidencia: Supuesto de despliegue por defecto; depende de la instalación</w:t>
             </w:r>
           </w:p>
         </w:tc>
@@ -12659,7 +12659,7 @@
                 <w:szCs w:val="16"/>
                 <w:lang w:val="es-GT"/>
               </w:rPr>
-              <w:t xml:space="preserve">No se encontraron referencias a token anti-CSRF en el código. Una página maliciosa puede hacer que el navegador de la víctima, con sesión activa, envíe un POST a transfer.htm o billpay.htm sin su consentimiento (F01). Evidencia: Hipótesis: búsqueda de 'csrf' sin resultados en el código fuente analizado.</w:t>
+              <w:t xml:space="preserve">No se encontraron referencias a token anti-CSRF en el código. Una página maliciosa puede hacer que el navegador de la víctima, con sesión activa, envíe un POST a transfer.htm o billpay.htm sin su consentimiento (F01). Evidencia: Hipótesis: búsqueda de 'csrf' sin resultados en el código fuente analizado</w:t>
             </w:r>
           </w:p>
         </w:tc>
@@ -12774,7 +12774,7 @@
                 <w:szCs w:val="16"/>
                 <w:lang w:val="es-GT"/>
               </w:rPr>
-              <w:t xml:space="preserve">Monto, cuenta origen y destino llegan como parámetros del cliente a /transfer, /deposit, /withdraw y /billpay (G02). Sin validación de negocio en el servidor ni integridad del canal, un atacante puede modificar el monto o ejecutar operaciones en nombre de otro. Evidencia: Hipótesis a validar: depende de las validaciones de la implementación del servicio.</w:t>
+              <w:t xml:space="preserve">Monto, cuenta origen y destino llegan como parámetros del cliente a /transfer, /deposit, /withdraw y /billpay (G02). Sin validación de negocio en el servidor ni integridad del canal, un atacante puede modificar el monto o ejecutar operaciones en nombre de otro. Evidencia: Hipótesis a validar: depende de las validaciones de la implementación del servicio</w:t>
             </w:r>
           </w:p>
         </w:tc>
@@ -12889,7 +12889,7 @@
                 <w:szCs w:val="16"/>
                 <w:lang w:val="es-GT"/>
               </w:rPr>
-              <w:t xml:space="preserve">No se observa limitación de intentos ni bloqueo de cuenta; el login por ruta facilita el scripting masivo (G01, G05). Un atacante con listas de credenciales filtradas puede suplantar clientes legítimos. Evidencia: Hipótesis: no se identificó rate limiting ni bloqueo en el código revisado.</w:t>
+              <w:t xml:space="preserve">No se observa limitación de intentos ni bloqueo de cuenta; el login por ruta facilita el scripting masivo (G01, G05). Un atacante con listas de credenciales filtradas puede suplantar clientes legítimos. Evidencia: Hipótesis: no se identificó rate limiting ni bloqueo en el código revisado</w:t>
             </w:r>
           </w:p>
         </w:tc>
@@ -13004,7 +13004,7 @@
                 <w:szCs w:val="16"/>
                 <w:lang w:val="es-GT"/>
               </w:rPr>
-              <w:t xml:space="preserve">loanProcessorThreshold y accessmode se leen de la tabla Parameter y pueden modificarse con setParameter o admin.htm. Combinado con las amenazas de acceso administrativo, un atacante puede forzar aprobaciones fraudulentas de préstamos (F13). Evidencia: Confirmado el uso del parámetro en AbstractLoanProcessor; la explotación depende de T03 y T04.</w:t>
+              <w:t xml:space="preserve">loanProcessorThreshold y accessmode se leen de la tabla Parameter y pueden modificarse con setParameter o admin.htm. Combinado con las amenazas de acceso administrativo, un atacante puede forzar aprobaciones fraudulentas de préstamos (F13). Evidencia: Confirmado el uso del parámetro en AbstractLoanProcessor; la explotación depende de T03 y T04</w:t>
             </w:r>
           </w:p>
         </w:tc>
@@ -13119,7 +13119,7 @@
                 <w:szCs w:val="16"/>
                 <w:lang w:val="es-GT"/>
               </w:rPr>
-              <w:t xml:space="preserve">ParaBankService está anotado con @CrossOriginResourceSharing(allowAllOrigins = true). Cualquier sitio web puede invocar la API desde el navegador de un usuario autenticado y leer la respuesta (F03). Evidencia: Confirmado en código (ParaBankService).</w:t>
+              <w:t xml:space="preserve">ParaBankService está anotado con @CrossOriginResourceSharing(allowAllOrigins = true). Cualquier sitio web puede invocar la API desde el navegador de un usuario autenticado y leer la respuesta (F03). Evidencia: Confirmado en código (ParaBankService)</w:t>
             </w:r>
           </w:p>
         </w:tc>
@@ -13234,7 +13234,7 @@
                 <w:szCs w:val="16"/>
                 <w:lang w:val="es-GT"/>
               </w:rPr>
-              <w:t xml:space="preserve">Las transacciones no llevan firma ni sello de tiempo verificable del cliente; si este niega una operación, el banco solo cuenta con su propio registro (F04, F12). Evidencia: Hipótesis: no se hallaron firmas ni confirmación fuerte de operaciones.</w:t>
+              <w:t xml:space="preserve">Las transacciones no llevan firma ni sello de tiempo verificable del cliente; si este niega una operación, el banco solo cuenta con su propio registro (F04, F12). Evidencia: Hipótesis: no se hallaron firmas ni confirmación fuerte de operaciones</w:t>
             </w:r>
           </w:p>
         </w:tc>
@@ -13349,7 +13349,7 @@
                 <w:szCs w:val="16"/>
                 <w:lang w:val="es-GT"/>
               </w:rPr>
-              <w:t xml:space="preserve">Como el módulo administrativo no exige autenticación, los cambios de parámetros, reinicios de BD y paradas de JMS no pueden atribuirse a una persona (F10, F11, F13). Evidencia: Consecuencia de T03; a validar.</w:t>
+              <w:t xml:space="preserve">Como el módulo administrativo no exige autenticación, los cambios de parámetros, reinicios de BD y paradas de JMS no pueden atribuirse a una persona (F10, F11, F13). Evidencia: Consecuencia de T03; a validar</w:t>
             </w:r>
           </w:p>
         </w:tc>
@@ -13464,7 +13464,7 @@
                 <w:szCs w:val="16"/>
                 <w:lang w:val="es-GT"/>
               </w:rPr>
-              <w:t xml:space="preserve">Los logs de log4j2 se escriben en archivo local sin protección de integridad; un atacante con acceso al host puede borrar rastros, y los registros pueden contener identificadores de clientes (F12). Evidencia: Hipótesis: configuración de log4j2 por defecto.</w:t>
+              <w:t xml:space="preserve">Los logs de log4j2 se escriben en archivo local sin protección de integridad; un atacante con acceso al host puede borrar rastros, y los registros pueden contener identificadores de clientes (F12). Evidencia: Hipótesis: configuración de log4j2 por defecto</w:t>
             </w:r>
           </w:p>
         </w:tc>
@@ -13579,7 +13579,7 @@
                 <w:szCs w:val="16"/>
                 <w:lang w:val="es-GT"/>
               </w:rPr>
-              <w:t xml:space="preserve">Sin rate limiting ni cuotas, un cliente puede saturar Tomcat o la BD con peticiones masivas (F03, F05, F06). Evidencia: Hipótesis: no se identificó limitación de tasa.</w:t>
+              <w:t xml:space="preserve">Sin rate limiting ni cuotas, un cliente puede saturar Tomcat o la BD con peticiones masivas (F03, F05, F06). Evidencia: Hipótesis: no se identificó limitación de tasa</w:t>
             </w:r>
           </w:p>
         </w:tc>
@@ -13694,7 +13694,7 @@
                 <w:szCs w:val="16"/>
                 <w:lang w:val="es-GT"/>
               </w:rPr>
-              <w:t xml:space="preserve">El listener usa 5 consumidores concurrentes y el broker no es persistente; una avalancha de solicitudes puede saturar la cola o perder mensajes legítimos (G08, G09). Evidencia: Confirmado en applicationContext-jms.xml (concurrentConsumers=5; persistent=false).</w:t>
+              <w:t xml:space="preserve">El listener usa 5 consumidores concurrentes y el broker no es persistente; una avalancha de solicitudes puede saturar la cola o perder mensajes legítimos (G08, G09). Evidencia: Confirmado en applicationContext-jms.xml (concurrentConsumers=5; persistent=false)</w:t>
             </w:r>
           </w:p>
         </w:tc>
@@ -13809,7 +13809,7 @@
                 <w:szCs w:val="16"/>
                 <w:lang w:val="es-GT"/>
               </w:rPr>
-              <w:t xml:space="preserve">La respuesta del proveedor cruza TB3 por WS/JMS; sin autenticación mutua ni firma, un tercero puede responder aprobaciones falsas. Evidencia: Hipótesis: depende de la configuración del proveedor.</w:t>
+              <w:t xml:space="preserve">La respuesta del proveedor cruza TB3 por WS/JMS; sin autenticación mutua ni firma, un tercero puede responder aprobaciones falsas. Evidencia: Hipótesis: depende de la configuración del proveedor</w:t>
             </w:r>
           </w:p>
         </w:tc>
@@ -13924,7 +13924,7 @@
                 <w:szCs w:val="16"/>
                 <w:lang w:val="es-GT"/>
               </w:rPr>
-              <w:t xml:space="preserve">Los endpoints SOAP procesan XML con JAXB/CXF; si el parser permite entidades externas, un mensaje manipulado puede leer archivos del servidor o provocar SSRF (F03). Evidencia: Hipótesis a validar con revisión de la configuración del parser.</w:t>
+              <w:t xml:space="preserve">Los endpoints SOAP procesan XML con JAXB/CXF; si el parser permite entidades externas, un mensaje manipulado puede leer archivos del servidor o provocar SSRF (F03). Evidencia: Hipótesis a validar con revisión de la configuración del parser</w:t>
             </w:r>
           </w:p>
         </w:tc>
@@ -14039,7 +14039,7 @@
                 <w:szCs w:val="16"/>
                 <w:lang w:val="es-GT"/>
               </w:rPr>
-              <w:t xml:space="preserve">La aplicación depende de Spring, CXF, WSS4J, ActiveMQ y Tomcat. Una vulnerabilidad conocida en cualquiera permite ejecución remota o escalamiento sin tocar el código propio. Evidencia: Riesgo general de cadena de suministro; verificable con SCA sobre pom.xml.</w:t>
+              <w:t xml:space="preserve">La aplicación depende de Spring, CXF, WSS4J, ActiveMQ y Tomcat. Una vulnerabilidad conocida en cualquiera permite ejecución remota o escalamiento sin tocar el código propio. Evidencia: Riesgo general de cadena de suministro; verificable con SCA sobre pom.xml</w:t>
             </w:r>
           </w:p>
         </w:tc>
@@ -14169,7 +14169,7 @@
                 <w:szCs w:val="16"/>
                 <w:lang w:val="es-GT"/>
               </w:rPr>
-              <w:t xml:space="preserve">No se verificó que JSESSIONID use Secure, HttpOnly y SameSite ni que exista timeout por inactividad; una sesión robada permite suplantar al cliente (F02). Evidencia: Hipótesis a validar en web.xml y en la configuración de Tomcat.</w:t>
+              <w:t xml:space="preserve">No se verificó que JSESSIONID use Secure, HttpOnly y SameSite ni que exista timeout por inactividad; una sesión robada permite suplantar al cliente (F02). Evidencia: Hipótesis a validar en web.xml y en la configuración de Tomcat</w:t>
             </w:r>
           </w:p>
         </w:tc>
@@ -24028,7 +24028,7 @@
                 <w:szCs w:val="16"/>
                 <w:lang w:val="es-GT"/>
               </w:rPr>
-              <w:t xml:space="preserve">Reemplazar la concatenación por parámetros con nombre y habilitar siempre SecureJdbcCustomerDao; agregar prueba unitaria de inyección.</w:t>
+              <w:t xml:space="preserve">Reemplazar la concatenación por parámetros con nombre y habilitar siempre SecureJdbcCustomerDao; agregar prueba unitaria de inyección</w:t>
             </w:r>
           </w:p>
         </w:tc>
@@ -24165,7 +24165,7 @@
                 <w:szCs w:val="16"/>
                 <w:lang w:val="es-GT"/>
               </w:rPr>
-              <w:t xml:space="preserve">Proteger las rutas administrativas con rol ADMIN y MFA, y separarlas del acceso público.</w:t>
+              <w:t xml:space="preserve">Proteger las rutas administrativas con rol ADMIN y MFA, y separarlas del acceso público</w:t>
             </w:r>
           </w:p>
         </w:tc>
@@ -24302,7 +24302,7 @@
                 <w:szCs w:val="16"/>
                 <w:lang w:val="es-GT"/>
               </w:rPr>
-              <w:t xml:space="preserve">Retirar de producción las operaciones de mantenimiento o protegerlas con OAuth 2.0 y scope administrativo detrás de un API Gateway.</w:t>
+              <w:t xml:space="preserve">Retirar de producción las operaciones de mantenimiento o protegerlas con OAuth 2.0 y scope administrativo detrás de un API Gateway</w:t>
             </w:r>
           </w:p>
         </w:tc>
@@ -24439,7 +24439,7 @@
                 <w:szCs w:val="16"/>
                 <w:lang w:val="es-GT"/>
               </w:rPr>
-              <w:t xml:space="preserve">Retirar el login por GET y migrar a un flujo con token (OAuth 2.0/OIDC); depurar logs existentes.</w:t>
+              <w:t xml:space="preserve">Retirar el login por GET y migrar a un flujo con token (OAuth 2.0/OIDC); depurar logs existentes</w:t>
             </w:r>
           </w:p>
         </w:tc>
@@ -24576,7 +24576,7 @@
                 <w:szCs w:val="16"/>
                 <w:lang w:val="es-GT"/>
               </w:rPr>
-              <w:t xml:space="preserve">Implementar verificación de propiedad en cada operación por ID y pruebas automatizadas de BOLA.</w:t>
+              <w:t xml:space="preserve">Implementar verificación de propiedad en cada operación por ID y pruebas automatizadas de BOLA</w:t>
             </w:r>
           </w:p>
         </w:tc>
@@ -24713,7 +24713,7 @@
                 <w:szCs w:val="16"/>
                 <w:lang w:val="es-GT"/>
               </w:rPr>
-              <w:t xml:space="preserve">Migrar contraseñas a hash Argon2id y cifrar o tokenizar el SSN.</w:t>
+              <w:t xml:space="preserve">Migrar contraseñas a hash Argon2id y cifrar o tokenizar el SSN</w:t>
             </w:r>
           </w:p>
         </w:tc>
@@ -24850,7 +24850,7 @@
                 <w:szCs w:val="16"/>
                 <w:lang w:val="es-GT"/>
               </w:rPr>
-              <w:t xml:space="preserve">Crear cuenta de servicio con mínimos privilegios, retirar sa, cerrar el puerto a la red y mover secretos a bóveda.</w:t>
+              <w:t xml:space="preserve">Crear cuenta de servicio con mínimos privilegios, retirar sa, cerrar el puerto a la red y mover secretos a bóveda</w:t>
             </w:r>
           </w:p>
         </w:tc>
@@ -24987,7 +24987,7 @@
                 <w:szCs w:val="16"/>
                 <w:lang w:val="es-GT"/>
               </w:rPr>
-              <w:t xml:space="preserve">Restringir el listener a la red interna, habilitar autenticación, ACL y TLS en ActiveMQ.</w:t>
+              <w:t xml:space="preserve">Restringir el listener a la red interna, habilitar autenticación, ACL y TLS en ActiveMQ</w:t>
             </w:r>
           </w:p>
         </w:tc>
@@ -25124,7 +25124,7 @@
                 <w:szCs w:val="16"/>
                 <w:lang w:val="es-GT"/>
               </w:rPr>
-              <w:t xml:space="preserve">Terminar TLS en un balanceador o en Tomcat, activar HSTS y marcar cookies Secure/HttpOnly.</w:t>
+              <w:t xml:space="preserve">Terminar TLS en un balanceador o en Tomcat, activar HSTS y marcar cookies Secure/HttpOnly</w:t>
             </w:r>
           </w:p>
         </w:tc>
@@ -25261,7 +25261,7 @@
                 <w:szCs w:val="16"/>
                 <w:lang w:val="es-GT"/>
               </w:rPr>
-              <w:t xml:space="preserve">Agregar token CSRF y SameSite en todos los formularios y exigir OTP para operaciones de alto valor.</w:t>
+              <w:t xml:space="preserve">Agregar token CSRF y SameSite en todos los formularios y exigir OTP para operaciones de alto valor</w:t>
             </w:r>
           </w:p>
         </w:tc>
@@ -25398,7 +25398,7 @@
                 <w:szCs w:val="16"/>
                 <w:lang w:val="es-GT"/>
               </w:rPr>
-              <w:t xml:space="preserve">Validar propiedad, saldo y límites en servidor; agregar firma de solicitud e idempotencia.</w:t>
+              <w:t xml:space="preserve">Validar propiedad, saldo y límites en servidor; agregar firma de solicitud e idempotencia</w:t>
             </w:r>
           </w:p>
         </w:tc>
@@ -25535,7 +25535,7 @@
                 <w:szCs w:val="16"/>
                 <w:lang w:val="es-GT"/>
               </w:rPr>
-              <w:t xml:space="preserve">Implementar MFA, bloqueo progresivo y rate limiting en el gateway.</w:t>
+              <w:t xml:space="preserve">Implementar MFA, bloqueo progresivo y rate limiting en el gateway</w:t>
             </w:r>
           </w:p>
         </w:tc>
@@ -25672,7 +25672,7 @@
                 <w:szCs w:val="16"/>
                 <w:lang w:val="es-GT"/>
               </w:rPr>
-              <w:t xml:space="preserve">Imponer doble aprobación, validación de rangos y auditoría de los parámetros críticos.</w:t>
+              <w:t xml:space="preserve">Imponer doble aprobación, validación de rangos y auditoría de los parámetros críticos</w:t>
             </w:r>
           </w:p>
         </w:tc>
@@ -25809,7 +25809,7 @@
                 <w:szCs w:val="16"/>
                 <w:lang w:val="es-GT"/>
               </w:rPr>
-              <w:t xml:space="preserve">Sustituir allowAllOrigins por una lista de orígenes autorizados.</w:t>
+              <w:t xml:space="preserve">Sustituir allowAllOrigins por una lista de orígenes autorizados</w:t>
             </w:r>
           </w:p>
         </w:tc>
@@ -25946,7 +25946,7 @@
                 <w:szCs w:val="16"/>
                 <w:lang w:val="es-GT"/>
               </w:rPr>
-              <w:t xml:space="preserve">Registrar evidencia de consentimiento (OTP, IP, dispositivo, hora) por cada transacción.</w:t>
+              <w:t xml:space="preserve">Registrar evidencia de consentimiento (OTP, IP, dispositivo, hora) por cada transacción</w:t>
             </w:r>
           </w:p>
         </w:tc>
@@ -26083,7 +26083,7 @@
                 <w:szCs w:val="16"/>
                 <w:lang w:val="es-GT"/>
               </w:rPr>
-              <w:t xml:space="preserve">Registrar usuario, hora y valor anterior y nuevo en cada cambio administrativo.</w:t>
+              <w:t xml:space="preserve">Registrar usuario, hora y valor anterior y nuevo en cada cambio administrativo</w:t>
             </w:r>
           </w:p>
         </w:tc>
@@ -26220,7 +26220,7 @@
                 <w:szCs w:val="16"/>
                 <w:lang w:val="es-GT"/>
               </w:rPr>
-              <w:t xml:space="preserve">Poner un API Gateway con cuotas y protección anti-DDoS delante de los servicios.</w:t>
+              <w:t xml:space="preserve">Poner un API Gateway con cuotas y protección anti-DDoS delante de los servicios</w:t>
             </w:r>
           </w:p>
         </w:tc>
@@ -26357,7 +26357,7 @@
                 <w:szCs w:val="16"/>
                 <w:lang w:val="es-GT"/>
               </w:rPr>
-              <w:t xml:space="preserve">Definir cuotas, cola persistente y monitoreo de profundidad.</w:t>
+              <w:t xml:space="preserve">Definir cuotas, cola persistente y monitoreo de profundidad</w:t>
             </w:r>
           </w:p>
         </w:tc>
@@ -26494,7 +26494,7 @@
                 <w:szCs w:val="16"/>
                 <w:lang w:val="es-GT"/>
               </w:rPr>
-              <w:t xml:space="preserve">Configurar atributos de cookie, rotación de sesión y expiración por inactividad.</w:t>
+              <w:t xml:space="preserve">Configurar atributos de cookie, rotación de sesión y expiración por inactividad</w:t>
             </w:r>
           </w:p>
         </w:tc>
@@ -26631,7 +26631,7 @@
                 <w:szCs w:val="16"/>
                 <w:lang w:val="es-GT"/>
               </w:rPr>
-              <w:t xml:space="preserve">Exigir mTLS y firma en la integración con proveedores.</w:t>
+              <w:t xml:space="preserve">Exigir mTLS y firma en la integración con proveedores</w:t>
             </w:r>
           </w:p>
         </w:tc>
@@ -26768,7 +26768,7 @@
                 <w:szCs w:val="16"/>
                 <w:lang w:val="es-GT"/>
               </w:rPr>
-              <w:t xml:space="preserve">Endurecer el parser XML y validar los mensajes contra el esquema.</w:t>
+              <w:t xml:space="preserve">Endurecer el parser XML y validar los mensajes contra el esquema</w:t>
             </w:r>
           </w:p>
         </w:tc>
@@ -26905,7 +26905,7 @@
                 <w:szCs w:val="16"/>
                 <w:lang w:val="es-GT"/>
               </w:rPr>
-              <w:t xml:space="preserve">Integrar SCA y SBOM al pipeline con política de fallo por severidad.</w:t>
+              <w:t xml:space="preserve">Integrar SCA y SBOM al pipeline con política de fallo por severidad</w:t>
             </w:r>
           </w:p>
         </w:tc>
@@ -27057,7 +27057,7 @@
                 <w:szCs w:val="16"/>
                 <w:lang w:val="es-GT"/>
               </w:rPr>
-              <w:t xml:space="preserve">Centralizar logs, protegerlos contra modificación y enmascarar datos sensibles.</w:t>
+              <w:t xml:space="preserve">Centralizar logs, protegerlos contra modificación y enmascarar datos sensibles</w:t>
             </w:r>
           </w:p>
         </w:tc>
@@ -27422,7 +27422,7 @@
                 <w:szCs w:val="16"/>
                 <w:lang w:val="es-GT"/>
               </w:rPr>
-              <w:t xml:space="preserve">Reemplazar la concatenación por parámetros con nombre y habilitar siempre SecureJdbcCustomerDao; agregar prueba unitaria de inyección.</w:t>
+              <w:t xml:space="preserve">Reemplazar la concatenación por parámetros con nombre y habilitar siempre SecureJdbcCustomerDao; agregar prueba unitaria de inyección</w:t>
             </w:r>
           </w:p>
         </w:tc>
@@ -27554,7 +27554,7 @@
                 <w:szCs w:val="16"/>
                 <w:lang w:val="es-GT"/>
               </w:rPr>
-              <w:t xml:space="preserve">Proteger las rutas administrativas con rol ADMIN y MFA, y separarlas del acceso público.</w:t>
+              <w:t xml:space="preserve">Proteger las rutas administrativas con rol ADMIN y MFA, y separarlas del acceso público</w:t>
             </w:r>
           </w:p>
         </w:tc>
@@ -27686,7 +27686,7 @@
                 <w:szCs w:val="16"/>
                 <w:lang w:val="es-GT"/>
               </w:rPr>
-              <w:t xml:space="preserve">Retirar de producción las operaciones de mantenimiento o protegerlas con OAuth 2.0 y scope administrativo detrás de un API Gateway.</w:t>
+              <w:t xml:space="preserve">Retirar de producción las operaciones de mantenimiento o protegerlas con OAuth 2.0 y scope administrativo detrás de un API Gateway</w:t>
             </w:r>
           </w:p>
         </w:tc>
@@ -27818,7 +27818,7 @@
                 <w:szCs w:val="16"/>
                 <w:lang w:val="es-GT"/>
               </w:rPr>
-              <w:t xml:space="preserve">Retirar el login por GET y migrar a un flujo con token (OAuth 2.0/OIDC); depurar logs existentes.</w:t>
+              <w:t xml:space="preserve">Retirar el login por GET y migrar a un flujo con token (OAuth 2.0/OIDC); depurar logs existentes</w:t>
             </w:r>
           </w:p>
         </w:tc>
@@ -27950,7 +27950,7 @@
                 <w:szCs w:val="16"/>
                 <w:lang w:val="es-GT"/>
               </w:rPr>
-              <w:t xml:space="preserve">Implementar verificación de propiedad en cada operación por ID y pruebas automatizadas de BOLA.</w:t>
+              <w:t xml:space="preserve">Implementar verificación de propiedad en cada operación por ID y pruebas automatizadas de BOLA</w:t>
             </w:r>
           </w:p>
         </w:tc>
@@ -28082,7 +28082,7 @@
                 <w:szCs w:val="16"/>
                 <w:lang w:val="es-GT"/>
               </w:rPr>
-              <w:t xml:space="preserve">Crear cuenta de servicio con mínimos privilegios, retirar sa, cerrar el puerto a la red y mover secretos a bóveda.</w:t>
+              <w:t xml:space="preserve">Crear cuenta de servicio con mínimos privilegios, retirar sa, cerrar el puerto a la red y mover secretos a bóveda</w:t>
             </w:r>
           </w:p>
         </w:tc>
@@ -28214,7 +28214,7 @@
                 <w:szCs w:val="16"/>
                 <w:lang w:val="es-GT"/>
               </w:rPr>
-              <w:t xml:space="preserve">Restringir el listener a la red interna, habilitar autenticación, ACL y TLS en ActiveMQ.</w:t>
+              <w:t xml:space="preserve">Restringir el listener a la red interna, habilitar autenticación, ACL y TLS en ActiveMQ</w:t>
             </w:r>
           </w:p>
         </w:tc>
@@ -28346,7 +28346,7 @@
                 <w:szCs w:val="16"/>
                 <w:lang w:val="es-GT"/>
               </w:rPr>
-              <w:t xml:space="preserve">Terminar TLS en un balanceador o en Tomcat, activar HSTS y marcar cookies Secure/HttpOnly.</w:t>
+              <w:t xml:space="preserve">Terminar TLS en un balanceador o en Tomcat, activar HSTS y marcar cookies Secure/HttpOnly</w:t>
             </w:r>
           </w:p>
         </w:tc>
@@ -28478,7 +28478,7 @@
                 <w:szCs w:val="16"/>
                 <w:lang w:val="es-GT"/>
               </w:rPr>
-              <w:t xml:space="preserve">Implementar MFA, bloqueo progresivo y rate limiting en el gateway.</w:t>
+              <w:t xml:space="preserve">Implementar MFA, bloqueo progresivo y rate limiting en el gateway</w:t>
             </w:r>
           </w:p>
         </w:tc>
@@ -28610,7 +28610,7 @@
                 <w:szCs w:val="16"/>
                 <w:lang w:val="es-GT"/>
               </w:rPr>
-              <w:t xml:space="preserve">Sustituir allowAllOrigins por una lista de orígenes autorizados.</w:t>
+              <w:t xml:space="preserve">Sustituir allowAllOrigins por una lista de orígenes autorizados</w:t>
             </w:r>
           </w:p>
         </w:tc>
@@ -28742,7 +28742,7 @@
                 <w:szCs w:val="16"/>
                 <w:lang w:val="es-GT"/>
               </w:rPr>
-              <w:t xml:space="preserve">Migrar contraseñas a hash Argon2id y cifrar o tokenizar el SSN.</w:t>
+              <w:t xml:space="preserve">Migrar contraseñas a hash Argon2id y cifrar o tokenizar el SSN</w:t>
             </w:r>
           </w:p>
         </w:tc>
@@ -28874,7 +28874,7 @@
                 <w:szCs w:val="16"/>
                 <w:lang w:val="es-GT"/>
               </w:rPr>
-              <w:t xml:space="preserve">Agregar token CSRF y SameSite en todos los formularios y exigir OTP para operaciones de alto valor.</w:t>
+              <w:t xml:space="preserve">Agregar token CSRF y SameSite en todos los formularios y exigir OTP para operaciones de alto valor</w:t>
             </w:r>
           </w:p>
         </w:tc>
@@ -29006,7 +29006,7 @@
                 <w:szCs w:val="16"/>
                 <w:lang w:val="es-GT"/>
               </w:rPr>
-              <w:t xml:space="preserve">Validar propiedad, saldo y límites en servidor; agregar firma de solicitud e idempotencia.</w:t>
+              <w:t xml:space="preserve">Validar propiedad, saldo y límites en servidor; agregar firma de solicitud e idempotencia</w:t>
             </w:r>
           </w:p>
         </w:tc>
@@ -29138,7 +29138,7 @@
                 <w:szCs w:val="16"/>
                 <w:lang w:val="es-GT"/>
               </w:rPr>
-              <w:t xml:space="preserve">Imponer doble aprobación, validación de rangos y auditoría de los parámetros críticos.</w:t>
+              <w:t xml:space="preserve">Imponer doble aprobación, validación de rangos y auditoría de los parámetros críticos</w:t>
             </w:r>
           </w:p>
         </w:tc>
@@ -29270,7 +29270,7 @@
                 <w:szCs w:val="16"/>
                 <w:lang w:val="es-GT"/>
               </w:rPr>
-              <w:t xml:space="preserve">Registrar evidencia de consentimiento (OTP, IP, dispositivo, hora) por cada transacción.</w:t>
+              <w:t xml:space="preserve">Registrar evidencia de consentimiento (OTP, IP, dispositivo, hora) por cada transacción</w:t>
             </w:r>
           </w:p>
         </w:tc>
@@ -29402,7 +29402,7 @@
                 <w:szCs w:val="16"/>
                 <w:lang w:val="es-GT"/>
               </w:rPr>
-              <w:t xml:space="preserve">Registrar usuario, hora y valor anterior y nuevo en cada cambio administrativo.</w:t>
+              <w:t xml:space="preserve">Registrar usuario, hora y valor anterior y nuevo en cada cambio administrativo</w:t>
             </w:r>
           </w:p>
         </w:tc>
@@ -29534,7 +29534,7 @@
                 <w:szCs w:val="16"/>
                 <w:lang w:val="es-GT"/>
               </w:rPr>
-              <w:t xml:space="preserve">Poner un API Gateway con cuotas y protección anti-DDoS delante de los servicios.</w:t>
+              <w:t xml:space="preserve">Poner un API Gateway con cuotas y protección anti-DDoS delante de los servicios</w:t>
             </w:r>
           </w:p>
         </w:tc>
@@ -29666,7 +29666,7 @@
                 <w:szCs w:val="16"/>
                 <w:lang w:val="es-GT"/>
               </w:rPr>
-              <w:t xml:space="preserve">Definir cuotas, cola persistente y monitoreo de profundidad.</w:t>
+              <w:t xml:space="preserve">Definir cuotas, cola persistente y monitoreo de profundidad</w:t>
             </w:r>
           </w:p>
         </w:tc>
@@ -29798,7 +29798,7 @@
                 <w:szCs w:val="16"/>
                 <w:lang w:val="es-GT"/>
               </w:rPr>
-              <w:t xml:space="preserve">Configurar atributos de cookie, rotación de sesión y expiración por inactividad.</w:t>
+              <w:t xml:space="preserve">Configurar atributos de cookie, rotación de sesión y expiración por inactividad</w:t>
             </w:r>
           </w:p>
         </w:tc>
@@ -29930,7 +29930,7 @@
                 <w:szCs w:val="16"/>
                 <w:lang w:val="es-GT"/>
               </w:rPr>
-              <w:t xml:space="preserve">Centralizar logs, protegerlos contra modificación y enmascarar datos sensibles.</w:t>
+              <w:t xml:space="preserve">Centralizar logs, protegerlos contra modificación y enmascarar datos sensibles</w:t>
             </w:r>
           </w:p>
         </w:tc>
@@ -30062,7 +30062,7 @@
                 <w:szCs w:val="16"/>
                 <w:lang w:val="es-GT"/>
               </w:rPr>
-              <w:t xml:space="preserve">Exigir mTLS y firma en la integración con proveedores.</w:t>
+              <w:t xml:space="preserve">Exigir mTLS y firma en la integración con proveedores</w:t>
             </w:r>
           </w:p>
         </w:tc>
@@ -30194,7 +30194,7 @@
                 <w:szCs w:val="16"/>
                 <w:lang w:val="es-GT"/>
               </w:rPr>
-              <w:t xml:space="preserve">Endurecer el parser XML y validar los mensajes contra el esquema.</w:t>
+              <w:t xml:space="preserve">Endurecer el parser XML y validar los mensajes contra el esquema</w:t>
             </w:r>
           </w:p>
         </w:tc>
@@ -30338,7 +30338,7 @@
                 <w:szCs w:val="16"/>
                 <w:lang w:val="es-GT"/>
               </w:rPr>
-              <w:t xml:space="preserve">Integrar SCA y SBOM al pipeline con política de fallo por severidad.</w:t>
+              <w:t xml:space="preserve">Integrar SCA y SBOM al pipeline con política de fallo por severidad</w:t>
             </w:r>
           </w:p>
         </w:tc>

</xml_diff>

<commit_message>
Tarea 2: aplica la reescritura de los párrafos al informe Word
Co-Authored-By: Claude Sonnet 5.5 <noreply@anthropic.com>
Claude-Session: https://claude.ai/code/session_016S2e3FucHCtgupXcPL28A1
</commit_message>
<xml_diff>
--- a/Seguridad de Aplicaciones/Tarea 2/Informe-Tarea2-ParaBank.docx
+++ b/Seguridad de Aplicaciones/Tarea 2/Informe-Tarea2-ParaBank.docx
@@ -2499,7 +2499,7 @@
         <w:rPr>
           <w:lang w:val="es-GT"/>
         </w:rPr>
-        <w:t xml:space="preserve">El presente informe documenta el modelo de amenazas de ParaBank, la aplicación bancaria de demostración de Parasoft, elaborado con OWASP Threat Dragon como se solicita en la Tarea 2 del curso. El análisis sigue la lógica de seguridad desde el diseño (shift-left): identificar qué puede salir mal antes de que el sistema llegue a producción, cuando corregir cuesta menos.</w:t>
+        <w:t xml:space="preserve">Este informe presenta el modelo de amenazas de ParaBank (la aplicación bancaria demo de Parasoft) desarrollado utilizando OWASP Threat Dragon, conforme a lo requerido en la Tarea 2 del curso. El análisis se adhiere a la lógica de la seguridad desde el diseño (shift-left): identificación de fallos potenciales antes de la producción, cuando la corrección cuesta menos.</w:t>
       </w:r>
     </w:p>
     <w:p>
@@ -2513,7 +2513,7 @@
         <w:rPr>
           <w:lang w:val="es-GT"/>
         </w:rPr>
-        <w:t xml:space="preserve">Se construyeron diagramas de flujo de datos de niveles 0, 1 y 2, se aplicó la metodología STRIDE sobre cada elemento y se priorizaron los riesgos por impacto y probabilidad. En total se identificaron 23 amenazas: 5 críticas, 8 altas, 9 medias y 1 baja. Para las críticas y altas se documentan casos de abuso, controles preventivos, detectivos y correctivos, y un plan de remediación a 12 meses.</w:t>
+        <w:t xml:space="preserve">Se elaboraron esquemas de flujo de datos de niveles 0, 1 y 2, se implementó la metodología STRIDE sobre cada elemento y se otorgó prioridad a los riesgos en función de su impacto y probabilidad. En total, se identificaron 23 amenazas: 5 de carácter crítico, 8 de grado alto, 9 de grado medio y 1 de grado bajo. Para las situaciones de críticas y altas, se registran casos de abuso, se implementan controles preventivos, se implementan medidas detectivas y correctivas, y se establece un plan de remediación a 12 meses.</w:t>
       </w:r>
     </w:p>
     <w:p>
@@ -2527,7 +2527,7 @@
         <w:rPr>
           <w:lang w:val="es-GT"/>
         </w:rPr>
-        <w:t xml:space="preserve">ParaBank es una aplicación vulnerable a propósito, creada para pruebas. Los hallazgos se presentan como si se tratara de un banco real para practicar el método; no constituyen una crítica a un producto productivo.</w:t>
+        <w:t xml:space="preserve">ParaBank constituye una aplicación de carácter vulnerable, concebida para la realización de pruebas. Los descubrimientos se manifiestan como si se tratara de una institución bancaria auténtica para implementar el método; no constituyen una evaluación crítica de un producto productivo.</w:t>
       </w:r>
     </w:p>
     <w:p>
@@ -2568,7 +2568,7 @@
         <w:rPr>
           <w:lang w:val="es-GT"/>
         </w:rPr>
-        <w:t xml:space="preserve"> ParaBank, en sus módulos de banca en línea: autenticación, cuentas, transferencias, pago de facturas, préstamos, administración, servicios SOAP/REST, base de datos y mensajería. El módulo auxiliar Bookstore queda fuera del alcance porque no forma parte del flujo bancario.</w:t>
+        <w:t xml:space="preserve"> ParaBank, a través de sus módulos de banca digital, ofrece servicios de autenticación, creación de cuentas, transferencias, pago de facturas, préstamos, gestión, servicios SOAP/REST, bases de datos y mensajería. El módulo auxiliar denominado Bookstore se encuentra fuera del alcance debido a su no integración en el flujo bancario.</w:t>
       </w:r>
     </w:p>
     <w:p>
@@ -2589,7 +2589,7 @@
         <w:rPr>
           <w:lang w:val="es-GT"/>
         </w:rPr>
-        <w:t xml:space="preserve"> Código público del proyecto (Parasoft, 2026), commit 13cc8d4c, y su archivo README. La documentación en línea de Parasoft no estaba accesible durante el trabajo, por lo que el análisis se apoya en el código fuente.</w:t>
+        <w:t xml:space="preserve"> El código público del proyecto, publicado por Parasoft en 2026, el commit 13cc8d4c y su correspondiente archivo README. Durante el periodo laboral, la documentación en línea de Parasoft no se encontraba accesible, por lo que el análisis se fundamenta en el código fuente.</w:t>
       </w:r>
     </w:p>
     <w:p>
@@ -2610,7 +2610,7 @@
         <w:rPr>
           <w:lang w:val="es-GT"/>
         </w:rPr>
-        <w:t xml:space="preserve"> Cada amenaza indica si está confirmada en el código o si es una hipótesis a validar. Una hipótesis es un riesgo plausible que no pudo comprobarse leyendo el código, por ejemplo el control de propiedad de los recursos en la API.</w:t>
+        <w:t xml:space="preserve"> Cada amenaza señala si está corroborada en el código o si se trata de una hipótesis que requiere validación. Una hipótesis se refiere a un riesgo plausible que no pudo ser verificado mediante la lectura del código, como el control de propiedad de los recursos en la interfaz de programación de aplicaciones (API).</w:t>
       </w:r>
     </w:p>
     <w:p>
@@ -2631,7 +2631,7 @@
         <w:rPr>
           <w:lang w:val="es-GT"/>
         </w:rPr>
-        <w:t xml:space="preserve"> Tomcat con la configuración por defecto del README (HTTP, sin TLS terminado en la aplicación), HyperSQL en el puerto TCP 9001 y ActiveMQ en el puerto TCP 61616. Si el despliegue real usa TLS o segmentación de red, la probabilidad de varias amenazas disminuye.</w:t>
+        <w:t xml:space="preserve"> Tomcat opera con la configuración preestablecida del README (HTTP, sin TLS finalizado en la aplicación), HyperSQL se encuentra en el puerto TCP 9001 y ActiveMQ se encuentra en TCP 61616. Si se emplea TLS o segmentación de red en el despliegue real, la probabilidad de varias amenazas disminuye.</w:t>
       </w:r>
     </w:p>
     <w:p>
@@ -2652,7 +2652,7 @@
         <w:rPr>
           <w:lang w:val="es-GT"/>
         </w:rPr>
-        <w:t xml:space="preserve"> La actividad pide validar las amenazas con Arquitectura y Desarrollo. Aquí solo se contrastaron con el código fuente; las hipótesis deben confirmarse con pruebas autorizadas en un entorno propio.</w:t>
+        <w:t xml:space="preserve"> La tarea solicita validar las amenazas asociadas con la disciplina de Arquitectura y Desarrollo. En este contexto, únicamente se realizó un contraste con el código fuente; las hipótesis deben ser corroboradas mediante pruebas autorizadas en un entorno propio.</w:t>
       </w:r>
     </w:p>
     <w:p>
@@ -2706,7 +2706,7 @@
         <w:rPr>
           <w:lang w:val="es-GT"/>
         </w:rPr>
-        <w:t xml:space="preserve">ParaBank es una aplicación Java desplegada en Apache Tomcat. La interfaz web usa Spring MVC y los servicios SOAP y REST se publican con Apache CXF. Ambos acceden a la misma lógica de negocio, que persiste en HyperSQL y usa ActiveMQ para el procesamiento de préstamos.</w:t>
+        <w:t xml:space="preserve">ParaBank es una aplicación de lenguaje de programación Java implementada en Apache Tomcat. La interfaz web se implementa mediante Spring MVC, mientras que los servicios SOAP y REST se publican utilizando Apache CXF. Ambos recurren a la misma lógica comercial, la cual se mantiene en HyperSQL y se utiliza en ActiveMQ para el procesamiento de préstamos.</w:t>
       </w:r>
     </w:p>
     <w:p>
@@ -5303,7 +5303,7 @@
         <w:rPr>
           <w:lang w:val="es-GT"/>
         </w:rPr>
-        <w:t xml:space="preserve">La Tabla 3 clasifica los flujos y registra las propiedades de confidencialidad e integridad que se configuraron en Threat Dragon. Los flujos que usan HTTP, JDBC o JMS sobre TCP se marcaron sin cifrado porque reflejan el despliegue por defecto; así el motor de reglas no oculta amenazas reales. Los flujos internos dentro de la misma JVM se marcaron como protegidos.</w:t>
+        <w:t xml:space="preserve">La Tabla 3 categoriza los flujos de información y documenta las características de confidencialidad e integridad establecidas en Threat Dragon. Los flujos que emplean HTTP, JDBC o JMS sobre TCP se identificaron sin cifrado debido a su representación del despliegue por defecto; de esta manera, el motor de reglas no oculta amenazas reales. Se identificaron como protegidos los flujos internos dentro de la misma JVM.</w:t>
       </w:r>
     </w:p>
     <w:p>
@@ -7374,7 +7374,7 @@
         <w:rPr>
           <w:lang w:val="es-GT"/>
         </w:rPr>
-        <w:t xml:space="preserve">Los diagramas se elaboraron en OWASP Threat Dragon. El Nivel 0 muestra el contexto del sistema, el Nivel 1 descompone los procesos, almacenes y flujos principales con sus fronteras de confianza, y el Nivel 2 detalla el servicio de API y el circuito de préstamos, que es la integración con terceros y middleware.</w:t>
+        <w:t xml:space="preserve">Los diagramas fueron confeccionados utilizando el software OWASP Threat Dragon. El Nivel 0 proporciona una representación del contexto del sistema, el Nivel 1 desglosa los procesos, almacenes y flujos principales con sus respectivas fronteras de confianza, mientras que el Nivel 2 especifica el servicio de API y el circuito de préstamos, que se refiere a la integración con terceros y middleware.</w:t>
       </w:r>
     </w:p>
     <w:p>
@@ -7408,7 +7408,7 @@
         <w:rPr>
           <w:lang w:val="es-GT"/>
         </w:rPr>
-        <w:t xml:space="preserve">Cuatro entidades externas interactúan con ParaBank: el cliente, el administrador, el sistema integrador que consume las APIs y el proveedor externo de préstamos. La frontera TB1 separa Internet de la aplicación y la frontera TB3 separa la aplicación del proveedor externo.</w:t>
+        <w:t xml:space="preserve">ParaBank está en interacción con cuatro entidades externas: el cliente, el administrador, el sistema integrador que consume las interfaces de programación de aplicaciones (APIs) y el proveedor externo de préstamos. La frontera TB1 distingue la aplicación de Internet, mientras que la frontera TB3 distingue la aplicación del proveedor externo.</w:t>
       </w:r>
     </w:p>
     <w:p>
@@ -7520,7 +7520,7 @@
         <w:rPr>
           <w:lang w:val="es-GT"/>
         </w:rPr>
-        <w:t xml:space="preserve">El Nivel 1 separa la interfaz web, los servicios SOAP/REST, la lógica de negocio, el procesador de préstamos y la administración. Los almacenes son la base de datos HyperSQL, el broker ActiveMQ y las bitácoras. Los procesos y los almacenes se modelaron por separado para no confundir las reglas de STRIDE entre unos y otros.</w:t>
+        <w:t xml:space="preserve">El Nivel 1 distingue la interfaz web, los servicios SOAP/REST, la lógica empresarial, el procesador de préstamos y la gestión. Las unidades de almacenamiento comprenden la base de datos HyperSQL, el intermediario ActiveMQ y las bitácoras. Los procesos y los almacenes fueron modelados de manera independiente para prevenir la confusión de las reglas de STRIDE entre ambos.</w:t>
       </w:r>
     </w:p>
     <w:p>
@@ -7632,7 +7632,7 @@
         <w:rPr>
           <w:lang w:val="es-GT"/>
         </w:rPr>
-        <w:t xml:space="preserve">Este nivel descompone el servicio de API en autenticación, transferencias y pagos, gestión de clientes y solicitud de préstamo, y muestra cómo viajan los mensajes por la cola JMS hasta el proveedor externo.</w:t>
+        <w:t xml:space="preserve">Este nivel desglosa el servicio de API en aspectos como la autenticación, las transferencias y pagos, la administración de clientes y la solicitud de préstamo, y expone el proceso de transmisión de mensajes a través de la cola JMS hasta el proveedor externo.</w:t>
       </w:r>
     </w:p>
     <w:p>
@@ -8237,7 +8237,7 @@
         <w:rPr>
           <w:lang w:val="es-GT"/>
         </w:rPr>
-        <w:t xml:space="preserve">Se aplicó STRIDE a cada flujo, proceso y almacén del diagrama. Las 23 amenazas se identificaron manualmente, apoyándose en el código fuente; no provienen del motor automático de Threat Dragon. Se recomienda ejecutar además la generación automática de la herramienta, comparar ambas listas y anotar las diferencias.</w:t>
+        <w:t xml:space="preserve">Se implementó la metodología STRIDE a cada flujo, proceso y almacén representado en el diagrama. Las 23 amenazas fueron identificadas manualmente, respaldadas por el código fuente; no se originan a partir del motor automático de Threat Dragon. Además, se aconseja implementar la generación automática de la herramienta, cotejar ambas listas y documentar las discrepancias detectadas.</w:t>
       </w:r>
     </w:p>
     <w:p>
@@ -11324,7 +11324,7 @@
         <w:rPr>
           <w:lang w:val="es-GT"/>
         </w:rPr>
-        <w:t xml:space="preserve">La Tabla 6 detalla cada amenaza indicando el flujo de datos, la frontera de confianza que cruza y el efecto concreto sobre el componente afectado. La columna final distingue lo confirmado en el código de lo que es una hipótesis a validar.</w:t>
+        <w:t xml:space="preserve">La Tabla 6 especifica cada amenaza, especificando el flujo de información, la frontera de confianza que se traspasa y el impacto concreto sobre el componente afectado. La columna final diferencia lo que ha sido confirmado en el código de lo que constituye una hipótesis a verificar.</w:t>
       </w:r>
     </w:p>
     <w:p>
@@ -14879,7 +14879,7 @@
         <w:rPr>
           <w:lang w:val="es-GT"/>
         </w:rPr>
-        <w:t xml:space="preserve">El impacto se valora como Crítico (4), Alto (3), Medio (2) o Bajo (1) y la probabilidad como Muy Alta (4), Alta (3), Media (2) o Baja (1). El riesgo es el producto de ambos: Crítico si es 9 o más, Alto de 6 a 8, Medio de 3 a 5 y Bajo de 1 a 2. Esta regla reproduce la tabla del enunciado de la tarea (Alto con Alto es Crítico, Alto con Medio es Alto, Medio con Medio es Medio y Bajo con Bajo es Bajo).</w:t>
+        <w:t xml:space="preserve">El impacto se evalúa en términos de Crítico (4), Alto (3), Medio (2) o Bajo (1), mientras que la probabilidad se clasifica en Muy Alta (4), Alta (3), Media (2) o Baja (1). El riesgo es el resultado de ambos factores: Crítico si la puntuación es de 9 o más, Alto si es de 6 a 8, Medio si es de 3 a 5 y Bajo si es de 1 a 2. Esta norma replica la tabla del enunciado correspondiente a la tarea (Alto con Alto es Crítico, Medio con Medio es Medio y Bajo con Bajo es Bajo).</w:t>
       </w:r>
     </w:p>
     <w:p>
@@ -17400,7 +17400,7 @@
         <w:rPr>
           <w:lang w:val="es-GT"/>
         </w:rPr>
-        <w:t xml:space="preserve">Siguiendo las estrategias vistas en clase, se propone mitigar todas las amenazas críticas y altas, transferir parte del riesgo de denegación de servicio mediante protección anti-DDoS o un servicio gestionado, aceptar formalmente la amenaza de nivel Bajo (T17) con revisión periódica y evitar publicar las operaciones de mantenimiento en producción.</w:t>
+        <w:t xml:space="preserve">Conforme a las estrategias discutidas en el aula, se plantea la mitigación de todas las amenazas críticas y elevadas, la transferencia de una porción del riesgo de interrupción del servicio a través de protección anti-DDoS o un servicio administrado, la aceptación formal de la amenaza de nivel Bajo (T17) con revisión periódica, y la evitación de la divulgación de las operaciones de mantenimiento en producción.</w:t>
       </w:r>
     </w:p>
     <w:p>
@@ -17434,7 +17434,7 @@
         <w:rPr>
           <w:lang w:val="es-GT"/>
         </w:rPr>
-        <w:t xml:space="preserve">Para cada amenaza crítica o alta se documentó el objetivo del atacante, el vector, las precondiciones, el método de explotación, el impacto y los controles preventivo, detectivo y correctivo.</w:t>
+        <w:t xml:space="preserve">Para cada amenaza crítica o elevada, se registró el objetivo del atacante, el vector, las condiciones de explotación, el impacto y los controles preventivos, detectivos y correctivos implementados.</w:t>
       </w:r>
     </w:p>
     <w:p>
@@ -20514,7 +20514,7 @@
         <w:rPr>
           <w:lang w:val="es-GT"/>
         </w:rPr>
-        <w:t xml:space="preserve">El objetivo de leer o alterar los datos de clientes puede alcanzarse por tres rutas: por la aplicación (inyección SQL en T01, enumeración de identificadores en T05 y credenciales expuestas en la URL en T02), por la infraestructura (conexión directa como sa en T07 y páginas de administración sin login en T03) y por la mensajería (mensajes al broker abierto en T08). Que existan varias rutas hacia el mismo objetivo explica por qué la mitigación debe cubrir todas las capas.</w:t>
+        <w:t xml:space="preserve">El propósito de visualizar o modificar la información de los clientes puede lograrse mediante tres vías: a través de la aplicación (introduciendo SQL en T01, enumerando identificadores en T05 y exponiendo credenciales en la URL en T02), a través de la infraestructura (conectando directamente como sa en T07 y accediendo a páginas de administración sin autenticación en T03) y mediante la mensajería (remitiendo mensajes al broker abierto en T08). La existencia de múltiples trayectorias hacia un objetivo común explica por qué la mitigación debe abarcar todas las capas.</w:t>
       </w:r>
     </w:p>
     <w:p>
@@ -20548,7 +20548,7 @@
         <w:rPr>
           <w:lang w:val="es-GT"/>
         </w:rPr>
-        <w:t xml:space="preserve">Cada amenaza se asoció a controles de aplicación, API, infraestructura y monitoreo. La última columna compara el riesgo inicial con el riesgo residual estimado tras aplicarlos; son valores a validar con el equipo y no una garantía.</w:t>
+        <w:t xml:space="preserve">Cada amenaza fue vinculada a controles de aplicación, interfaz de programación de aplicaciones (API), infraestructura y monitoreo. La columna final contrasta el riesgo inicial con el riesgo residual proyectado tras su aplicación; estos son valores que deben ser validados con el equipo, no constituyen una garantía.</w:t>
       </w:r>
     </w:p>
     <w:p>
@@ -30423,7 +30423,7 @@
         <w:rPr>
           <w:lang w:val="es-GT"/>
         </w:rPr>
-        <w:t xml:space="preserve">El modelado de amenazas de ParaBank muestra que las debilidades más graves están en decisiones de diseño y configuración, no en fallos exóticos: una consulta SQL construida con concatenación, credenciales enviadas en la URL, funciones administrativas sin autenticación, una base de datos con la cuenta de administración sin contraseña y un broker de mensajes expuesto. Las cinco amenazas críticas coinciden con lo que se espera encontrar en una prueba de penetración sobre una aplicación ya en producción, pero aquí se identificaron desde el diseño.</w:t>
+        <w:t xml:space="preserve">La modelización de amenazas realizada por ParaBank revela que las vulnerabilidades más severas se encuentran en decisiones de diseño y configuración, no en fallos exóticos: una consulta SQL desarrollada con concatenación, credenciales transmitidas en la URL, funciones administrativas sin autenticación, una base de datos con la cuenta de administración sin contraseña y un gestor de mensajes expuesto. Las cinco amenazas críticas se alinean con lo anticipado en una prueba de penetración sobre una aplicación ya en producción; sin embargo, en este caso, se identificaron desde el diseño.</w:t>
       </w:r>
     </w:p>
     <w:p>
@@ -30437,7 +30437,7 @@
         <w:rPr>
           <w:lang w:val="es-GT"/>
         </w:rPr>
-        <w:t xml:space="preserve">Esa es la ventaja de aplicar la seguridad desde el inicio. Corregir estas amenazas antes del despliegue requiere cambios acotados, como parametrizar consultas, separar la administración y activar autenticación y TLS. Hacerlo después implica reingeniería, compras de emergencia y riesgo para clientes y transacciones. El siguiente paso es validar las hipótesis con pruebas autorizadas y con los equipos de Arquitectura y Desarrollo, y mantener el modelo en Threat Dragon como artefacto vivo del ciclo de desarrollo seguro.</w:t>
+        <w:t xml:space="preserve">Esta es la ventaja inherente a la implementación temprana de la seguridad. Corregir estas amenazas antes de su implementación demanda modificaciones limitadas, tales como la parametrización de consultas, la separación de la administración y la activación de autenticación y TLS. La ejecución subsecuente conlleva la reingeniería, adquisiciones de emergencia y el riesgo para los clientes y las transacciones. La etapa subsecuente consiste en corroborar las hipótesis mediante pruebas autorizadas y colaborar con los equipos de Arquitectura y Desarrollo, manteniendo el modelo en Threat Dragon como un artefacto vivo en el ciclo de desarrollo seguro.</w:t>
       </w:r>
     </w:p>
     <w:p>

</xml_diff>

<commit_message>
Tarea 2: corrige sentido de varios párrafos reescritos
Co-Authored-By: Claude Sonnet 5.5 <noreply@anthropic.com>
Claude-Session: https://claude.ai/code/session_016S2e3FucHCtgupXcPL28A1
</commit_message>
<xml_diff>
--- a/Seguridad de Aplicaciones/Tarea 2/Informe-Tarea2-ParaBank.docx
+++ b/Seguridad de Aplicaciones/Tarea 2/Informe-Tarea2-ParaBank.docx
@@ -2652,7 +2652,7 @@
         <w:rPr>
           <w:lang w:val="es-GT"/>
         </w:rPr>
-        <w:t xml:space="preserve"> La tarea solicita validar las amenazas asociadas con la disciplina de Arquitectura y Desarrollo. En este contexto, únicamente se realizó un contraste con el código fuente; las hipótesis deben ser corroboradas mediante pruebas autorizadas en un entorno propio.</w:t>
+        <w:t xml:space="preserve"> La tarea solicita validar las amenazas con los equipos de Arquitectura y Desarrollo. En este contexto, únicamente se realizó un contraste con el código fuente; las hipótesis deben ser corroboradas mediante pruebas autorizadas en un entorno propio.</w:t>
       </w:r>
     </w:p>
     <w:p>
@@ -2706,7 +2706,7 @@
         <w:rPr>
           <w:lang w:val="es-GT"/>
         </w:rPr>
-        <w:t xml:space="preserve">ParaBank es una aplicación de lenguaje de programación Java implementada en Apache Tomcat. La interfaz web se implementa mediante Spring MVC, mientras que los servicios SOAP y REST se publican utilizando Apache CXF. Ambos recurren a la misma lógica comercial, la cual se mantiene en HyperSQL y se utiliza en ActiveMQ para el procesamiento de préstamos.</w:t>
+        <w:t xml:space="preserve">ParaBank es una aplicación desarrollada en Java e implementada en Apache Tomcat. La interfaz web se implementa mediante Spring MVC, mientras que los servicios SOAP y REST se publican utilizando Apache CXF. Ambos recurren a la misma lógica de negocio, cuyos datos se almacenan en HyperSQL y que utiliza ActiveMQ para el procesamiento de préstamos.</w:t>
       </w:r>
     </w:p>
     <w:p>
@@ -11324,7 +11324,7 @@
         <w:rPr>
           <w:lang w:val="es-GT"/>
         </w:rPr>
-        <w:t xml:space="preserve">La Tabla 6 especifica cada amenaza, especificando el flujo de información, la frontera de confianza que se traspasa y el impacto concreto sobre el componente afectado. La columna final diferencia lo que ha sido confirmado en el código de lo que constituye una hipótesis a verificar.</w:t>
+        <w:t xml:space="preserve">La Tabla 6 detalla cada amenaza, indicando el flujo de información, la frontera de confianza que se traspasa y el impacto concreto sobre el componente afectado. La columna final diferencia lo que ha sido confirmado en el código de lo que constituye una hipótesis a verificar.</w:t>
       </w:r>
     </w:p>
     <w:p>
@@ -17434,7 +17434,7 @@
         <w:rPr>
           <w:lang w:val="es-GT"/>
         </w:rPr>
-        <w:t xml:space="preserve">Para cada amenaza crítica o elevada, se registró el objetivo del atacante, el vector, las condiciones de explotación, el impacto y los controles preventivos, detectivos y correctivos implementados.</w:t>
+        <w:t xml:space="preserve">Para cada amenaza crítica o elevada, se registró el objetivo del atacante, el vector, las precondiciones, el método de explotación, el impacto y los controles preventivos, detectivos y correctivos propuestos.</w:t>
       </w:r>
     </w:p>
     <w:p>
@@ -30423,7 +30423,7 @@
         <w:rPr>
           <w:lang w:val="es-GT"/>
         </w:rPr>
-        <w:t xml:space="preserve">La modelización de amenazas realizada por ParaBank revela que las vulnerabilidades más severas se encuentran en decisiones de diseño y configuración, no en fallos exóticos: una consulta SQL desarrollada con concatenación, credenciales transmitidas en la URL, funciones administrativas sin autenticación, una base de datos con la cuenta de administración sin contraseña y un gestor de mensajes expuesto. Las cinco amenazas críticas se alinean con lo anticipado en una prueba de penetración sobre una aplicación ya en producción; sin embargo, en este caso, se identificaron desde el diseño.</w:t>
+        <w:t xml:space="preserve">La modelización de amenazas de ParaBank revela que las vulnerabilidades más severas se encuentran en decisiones de diseño y configuración, no en fallos exóticos: una consulta SQL desarrollada con concatenación, credenciales transmitidas en la URL, funciones administrativas sin autenticación, una base de datos con la cuenta de administración sin contraseña y un gestor de mensajes expuesto. Las cinco amenazas críticas se alinean con lo anticipado en una prueba de penetración sobre una aplicación ya en producción; sin embargo, en este caso, se identificaron desde el diseño.</w:t>
       </w:r>
     </w:p>
     <w:p>
@@ -30437,7 +30437,7 @@
         <w:rPr>
           <w:lang w:val="es-GT"/>
         </w:rPr>
-        <w:t xml:space="preserve">Esta es la ventaja inherente a la implementación temprana de la seguridad. Corregir estas amenazas antes de su implementación demanda modificaciones limitadas, tales como la parametrización de consultas, la separación de la administración y la activación de autenticación y TLS. La ejecución subsecuente conlleva la reingeniería, adquisiciones de emergencia y el riesgo para los clientes y las transacciones. La etapa subsecuente consiste en corroborar las hipótesis mediante pruebas autorizadas y colaborar con los equipos de Arquitectura y Desarrollo, manteniendo el modelo en Threat Dragon como un artefacto vivo en el ciclo de desarrollo seguro.</w:t>
+        <w:t xml:space="preserve">Esta es la ventaja inherente a la implementación temprana de la seguridad. Corregir estas amenazas antes de su implementación demanda modificaciones limitadas, tales como la parametrización de consultas, la separación de la administración y la activación de autenticación y TLS. Hacerlo después implica reingeniería, adquisiciones de emergencia y riesgo para los clientes y las transacciones. La etapa subsecuente consiste en corroborar las hipótesis mediante pruebas autorizadas y colaborar con los equipos de Arquitectura y Desarrollo, manteniendo el modelo en Threat Dragon como un artefacto vivo en el ciclo de desarrollo seguro.</w:t>
       </w:r>
     </w:p>
     <w:p>

</xml_diff>

<commit_message>
Tarea 2: inserta las capturas de los DFD en el informe Word
Co-Authored-By: Claude Sonnet 5.5 <noreply@anthropic.com>
Claude-Session: https://claude.ai/code/session_016S2e3FucHCtgupXcPL28A1
</commit_message>
<xml_diff>
--- a/Seguridad de Aplicaciones/Tarea 2/Informe-Tarea2-ParaBank.docx
+++ b/Seguridad de Aplicaciones/Tarea 2/Informe-Tarea2-ParaBank.docx
@@ -7447,24 +7447,47 @@
     <w:p>
       <w:pPr>
         <w:keepNext/>
-        <w:pBdr>
-          <w:top w:val="single" w:sz="4" w:space="6" w:color="999999"/>
-          <w:left w:val="single" w:sz="4" w:space="6" w:color="999999"/>
-          <w:bottom w:val="single" w:sz="4" w:space="6" w:color="999999"/>
-          <w:right w:val="single" w:sz="4" w:space="6" w:color="999999"/>
-        </w:pBdr>
-        <w:spacing w:before="240" w:after="240"/>
+        <w:spacing w:before="120" w:after="60"/>
         <w:jc w:val="center"/>
         <w:rPr>
           <w:lang w:val="es-GT"/>
         </w:rPr>
       </w:pPr>
       <w:r>
-        <w:rPr>
-          <w:highlight w:val="yellow"/>
-          <w:lang w:val="es-GT"/>
-        </w:rPr>
-        <w:t xml:space="preserve">[Insertar aquí: captura o exportación PNG del diagrama «Nivel 0 – Contexto» de Threat Dragon]</w:t>
+        <w:drawing>
+          <wp:inline distT="0" distB="0" distL="0" distR="0">
+            <wp:extent cx="5900000" cy="2528571"/>
+            <wp:docPr id="600" name="Figura 1" descr="DFD nivel 0 de ParaBank"/>
+            <wp:cNvGraphicFramePr>
+              <a:graphicFrameLocks xmlns:a="http://schemas.openxmlformats.org/drawingml/2006/main" noChangeAspect="1"/>
+            </wp:cNvGraphicFramePr>
+            <a:graphic xmlns:a="http://schemas.openxmlformats.org/drawingml/2006/main">
+              <a:graphicData uri="http://schemas.openxmlformats.org/drawingml/2006/picture">
+                <pic:pic xmlns:pic="http://schemas.openxmlformats.org/drawingml/2006/picture">
+                  <pic:nvPicPr>
+                    <pic:cNvPr id="600" name="dfd_nivel0.png"/>
+                    <pic:cNvPicPr/>
+                  </pic:nvPicPr>
+                  <pic:blipFill>
+                    <a:blip r:embed="rIdDfd0"/>
+                    <a:stretch>
+                      <a:fillRect/>
+                    </a:stretch>
+                  </pic:blipFill>
+                  <pic:spPr>
+                    <a:xfrm>
+                      <a:off x="0" y="0"/>
+                      <a:ext cx="5900000" cy="2528571"/>
+                    </a:xfrm>
+                    <a:prstGeom prst="rect">
+                      <a:avLst/>
+                    </a:prstGeom>
+                  </pic:spPr>
+                </pic:pic>
+              </a:graphicData>
+            </a:graphic>
+          </wp:inline>
+        </w:drawing>
       </w:r>
     </w:p>
     <w:p>
@@ -7559,24 +7582,47 @@
     <w:p>
       <w:pPr>
         <w:keepNext/>
-        <w:pBdr>
-          <w:top w:val="single" w:sz="4" w:space="6" w:color="999999"/>
-          <w:left w:val="single" w:sz="4" w:space="6" w:color="999999"/>
-          <w:bottom w:val="single" w:sz="4" w:space="6" w:color="999999"/>
-          <w:right w:val="single" w:sz="4" w:space="6" w:color="999999"/>
-        </w:pBdr>
-        <w:spacing w:before="240" w:after="240"/>
+        <w:spacing w:before="120" w:after="60"/>
         <w:jc w:val="center"/>
         <w:rPr>
           <w:lang w:val="es-GT"/>
         </w:rPr>
       </w:pPr>
       <w:r>
-        <w:rPr>
-          <w:highlight w:val="yellow"/>
-          <w:lang w:val="es-GT"/>
-        </w:rPr>
-        <w:t xml:space="preserve">[Insertar aquí: captura o exportación PNG del diagrama «Nivel 1» de Threat Dragon]</w:t>
+        <w:drawing>
+          <wp:inline distT="0" distB="0" distL="0" distR="0">
+            <wp:extent cx="5900000" cy="2447004"/>
+            <wp:docPr id="601" name="Figura 2" descr="DFD nivel 1 de ParaBank"/>
+            <wp:cNvGraphicFramePr>
+              <a:graphicFrameLocks xmlns:a="http://schemas.openxmlformats.org/drawingml/2006/main" noChangeAspect="1"/>
+            </wp:cNvGraphicFramePr>
+            <a:graphic xmlns:a="http://schemas.openxmlformats.org/drawingml/2006/main">
+              <a:graphicData uri="http://schemas.openxmlformats.org/drawingml/2006/picture">
+                <pic:pic xmlns:pic="http://schemas.openxmlformats.org/drawingml/2006/picture">
+                  <pic:nvPicPr>
+                    <pic:cNvPr id="601" name="dfd_nivel1.png"/>
+                    <pic:cNvPicPr/>
+                  </pic:nvPicPr>
+                  <pic:blipFill>
+                    <a:blip r:embed="rIdDfd1"/>
+                    <a:stretch>
+                      <a:fillRect/>
+                    </a:stretch>
+                  </pic:blipFill>
+                  <pic:spPr>
+                    <a:xfrm>
+                      <a:off x="0" y="0"/>
+                      <a:ext cx="5900000" cy="2447004"/>
+                    </a:xfrm>
+                    <a:prstGeom prst="rect">
+                      <a:avLst/>
+                    </a:prstGeom>
+                  </pic:spPr>
+                </pic:pic>
+              </a:graphicData>
+            </a:graphic>
+          </wp:inline>
+        </w:drawing>
       </w:r>
     </w:p>
     <w:p>
@@ -7671,24 +7717,47 @@
     <w:p>
       <w:pPr>
         <w:keepNext/>
-        <w:pBdr>
-          <w:top w:val="single" w:sz="4" w:space="6" w:color="999999"/>
-          <w:left w:val="single" w:sz="4" w:space="6" w:color="999999"/>
-          <w:bottom w:val="single" w:sz="4" w:space="6" w:color="999999"/>
-          <w:right w:val="single" w:sz="4" w:space="6" w:color="999999"/>
-        </w:pBdr>
-        <w:spacing w:before="240" w:after="240"/>
+        <w:spacing w:before="120" w:after="60"/>
         <w:jc w:val="center"/>
         <w:rPr>
           <w:lang w:val="es-GT"/>
         </w:rPr>
       </w:pPr>
       <w:r>
-        <w:rPr>
-          <w:highlight w:val="yellow"/>
-          <w:lang w:val="es-GT"/>
-        </w:rPr>
-        <w:t xml:space="preserve">[Insertar aquí: captura o exportación PNG del diagrama «Nivel 2» de Threat Dragon]</w:t>
+        <w:drawing>
+          <wp:inline distT="0" distB="0" distL="0" distR="0">
+            <wp:extent cx="5900000" cy="2566561"/>
+            <wp:docPr id="602" name="Figura 3" descr="DFD nivel 2 de ParaBank"/>
+            <wp:cNvGraphicFramePr>
+              <a:graphicFrameLocks xmlns:a="http://schemas.openxmlformats.org/drawingml/2006/main" noChangeAspect="1"/>
+            </wp:cNvGraphicFramePr>
+            <a:graphic xmlns:a="http://schemas.openxmlformats.org/drawingml/2006/main">
+              <a:graphicData uri="http://schemas.openxmlformats.org/drawingml/2006/picture">
+                <pic:pic xmlns:pic="http://schemas.openxmlformats.org/drawingml/2006/picture">
+                  <pic:nvPicPr>
+                    <pic:cNvPr id="602" name="dfd_nivel2.png"/>
+                    <pic:cNvPicPr/>
+                  </pic:nvPicPr>
+                  <pic:blipFill>
+                    <a:blip r:embed="rIdDfd2"/>
+                    <a:stretch>
+                      <a:fillRect/>
+                    </a:stretch>
+                  </pic:blipFill>
+                  <pic:spPr>
+                    <a:xfrm>
+                      <a:off x="0" y="0"/>
+                      <a:ext cx="5900000" cy="2566561"/>
+                    </a:xfrm>
+                    <a:prstGeom prst="rect">
+                      <a:avLst/>
+                    </a:prstGeom>
+                  </pic:spPr>
+                </pic:pic>
+              </a:graphicData>
+            </a:graphic>
+          </wp:inline>
+        </w:drawing>
       </w:r>
     </w:p>
     <w:p>

</xml_diff>

<commit_message>
Tarea 2: agrega la figura del reporte de Threat Dragon al informe
Co-Authored-By: Claude Sonnet 5.5 <noreply@anthropic.com>
Claude-Session: https://claude.ai/code/session_016S2e3FucHCtgupXcPL28A1
</commit_message>
<xml_diff>
--- a/Seguridad de Aplicaciones/Tarea 2/Informe-Tarea2-ParaBank.docx
+++ b/Seguridad de Aplicaciones/Tarea 2/Informe-Tarea2-ParaBank.docx
@@ -14791,30 +14791,53 @@
           <w:i/>
           <w:lang w:val="es-GT"/>
         </w:rPr>
-        <w:t xml:space="preserve">Lista de amenazas de un elemento en Threat Dragon</w:t>
+        <w:t xml:space="preserve">Amenazas del elemento «Interfaz web» en el reporte de Threat Dragon</w:t>
       </w:r>
     </w:p>
     <w:p>
       <w:pPr>
         <w:keepNext/>
-        <w:pBdr>
-          <w:top w:val="single" w:sz="4" w:space="6" w:color="999999"/>
-          <w:left w:val="single" w:sz="4" w:space="6" w:color="999999"/>
-          <w:bottom w:val="single" w:sz="4" w:space="6" w:color="999999"/>
-          <w:right w:val="single" w:sz="4" w:space="6" w:color="999999"/>
-        </w:pBdr>
-        <w:spacing w:before="240" w:after="240"/>
+        <w:spacing w:before="120" w:after="60"/>
         <w:jc w:val="center"/>
         <w:rPr>
           <w:lang w:val="es-GT"/>
         </w:rPr>
       </w:pPr>
       <w:r>
-        <w:rPr>
-          <w:highlight w:val="yellow"/>
-          <w:lang w:val="es-GT"/>
-        </w:rPr>
-        <w:t xml:space="preserve">[Insertar aquí: captura del panel «Amenazas» al seleccionar un elemento con borde rojo, por ejemplo «Administración y utilidades»]</w:t>
+        <w:drawing>
+          <wp:inline distT="0" distB="0" distL="0" distR="0">
+            <wp:extent cx="5900000" cy="2775198"/>
+            <wp:docPr id="603" name="Figura 4" descr="Amenazas del elemento Interfaz web en el reporte de Threat Dragon"/>
+            <wp:cNvGraphicFramePr>
+              <a:graphicFrameLocks xmlns:a="http://schemas.openxmlformats.org/drawingml/2006/main" noChangeAspect="1"/>
+            </wp:cNvGraphicFramePr>
+            <a:graphic xmlns:a="http://schemas.openxmlformats.org/drawingml/2006/main">
+              <a:graphicData uri="http://schemas.openxmlformats.org/drawingml/2006/picture">
+                <pic:pic xmlns:pic="http://schemas.openxmlformats.org/drawingml/2006/picture">
+                  <pic:nvPicPr>
+                    <pic:cNvPr id="603" name="reporte_amenazas.png"/>
+                    <pic:cNvPicPr/>
+                  </pic:nvPicPr>
+                  <pic:blipFill>
+                    <a:blip r:embed="rIdDfd3"/>
+                    <a:stretch>
+                      <a:fillRect/>
+                    </a:stretch>
+                  </pic:blipFill>
+                  <pic:spPr>
+                    <a:xfrm>
+                      <a:off x="0" y="0"/>
+                      <a:ext cx="5900000" cy="2775198"/>
+                    </a:xfrm>
+                    <a:prstGeom prst="rect">
+                      <a:avLst/>
+                    </a:prstGeom>
+                  </pic:spPr>
+                </pic:pic>
+              </a:graphicData>
+            </a:graphic>
+          </wp:inline>
+        </w:drawing>
       </w:r>
     </w:p>
     <w:p>
@@ -14836,85 +14859,7 @@
         <w:rPr>
           <w:lang w:val="es-GT"/>
         </w:rPr>
-        <w:t xml:space="preserve">Elaboración propia con OWASP Threat Dragon.</w:t>
-      </w:r>
-    </w:p>
-    <w:p>
-      <w:pPr>
-        <w:keepNext/>
-        <w:spacing w:before="120" w:after="0"/>
-        <w:jc w:val="left"/>
-        <w:rPr>
-          <w:lang w:val="es-GT"/>
-        </w:rPr>
-      </w:pPr>
-      <w:r>
-        <w:rPr>
-          <w:b/>
-          <w:lang w:val="es-GT"/>
-        </w:rPr>
-        <w:t xml:space="preserve">Figura 5</w:t>
-      </w:r>
-    </w:p>
-    <w:p>
-      <w:pPr>
-        <w:keepNext/>
-        <w:jc w:val="left"/>
-        <w:rPr>
-          <w:lang w:val="es-GT"/>
-        </w:rPr>
-      </w:pPr>
-      <w:r>
-        <w:rPr>
-          <w:i/>
-          <w:lang w:val="es-GT"/>
-        </w:rPr>
-        <w:t xml:space="preserve">Propiedades de un flujo de datos en Threat Dragon</w:t>
-      </w:r>
-    </w:p>
-    <w:p>
-      <w:pPr>
-        <w:keepNext/>
-        <w:pBdr>
-          <w:top w:val="single" w:sz="4" w:space="6" w:color="999999"/>
-          <w:left w:val="single" w:sz="4" w:space="6" w:color="999999"/>
-          <w:bottom w:val="single" w:sz="4" w:space="6" w:color="999999"/>
-          <w:right w:val="single" w:sz="4" w:space="6" w:color="999999"/>
-        </w:pBdr>
-        <w:spacing w:before="240" w:after="240"/>
-        <w:jc w:val="center"/>
-        <w:rPr>
-          <w:lang w:val="es-GT"/>
-        </w:rPr>
-      </w:pPr>
-      <w:r>
-        <w:rPr>
-          <w:highlight w:val="yellow"/>
-          <w:lang w:val="es-GT"/>
-        </w:rPr>
-        <w:t xml:space="preserve">[Insertar aquí: captura del panel «Propiedades» de un flujo, mostrando protocolo HTTP y cifrado desactivado]</w:t>
-      </w:r>
-    </w:p>
-    <w:p>
-      <w:pPr>
-        <w:spacing w:before="60"/>
-        <w:jc w:val="left"/>
-        <w:rPr>
-          <w:lang w:val="es-GT"/>
-        </w:rPr>
-      </w:pPr>
-      <w:r>
-        <w:rPr>
-          <w:i/>
-          <w:lang w:val="es-GT"/>
-        </w:rPr>
-        <w:t xml:space="preserve">Nota. </w:t>
-      </w:r>
-      <w:r>
-        <w:rPr>
-          <w:lang w:val="es-GT"/>
-        </w:rPr>
-        <w:t xml:space="preserve">Elaboración propia con OWASP Threat Dragon.</w:t>
+        <w:t xml:space="preserve">Fragmento del reporte PDF generado por OWASP Threat Dragon. Muestra las amenazas T10 y T23 con su tipo, prioridad, estado y mitigaciones. La herramienta solo maneja las prioridades Alta, Media y Baja, por lo que las amenazas de riesgo Crítico aparecen como Alta.</w:t>
       </w:r>
     </w:p>
     <w:p>

</xml_diff>

<commit_message>
Tarea 2: corrige referencia, fuente y anchos de columna del informe
Co-Authored-By: Claude Sonnet 5.5 <noreply@anthropic.com>
Claude-Session: https://claude.ai/code/session_016S2e3FucHCtgupXcPL28A1
</commit_message>
<xml_diff>
--- a/Seguridad de Aplicaciones/Tarea 2/Informe-Tarea2-ParaBank.docx
+++ b/Seguridad de Aplicaciones/Tarea 2/Informe-Tarea2-ParaBank.docx
@@ -2791,7 +2791,7 @@
         <w:rPr>
           <w:lang w:val="es-GT"/>
         </w:rPr>
-        <w:t xml:space="preserve"> El código público del proyecto, publicado por Parasoft en 2026, el commit 13cc8d4c y su correspondiente archivo README. Durante el periodo laboral, la documentación en línea de Parasoft no se encontraba accesible, por lo que el análisis se fundamenta en el código fuente.</w:t>
+        <w:t xml:space="preserve"> El código público del proyecto (Parasoft, 2026), en el commit 13cc8d4c, y su correspondiente archivo README. Durante el periodo laboral, la documentación en línea de Parasoft no se encontraba accesible, por lo que el análisis se fundamenta en el código fuente.</w:t>
       </w:r>
     </w:p>
     <w:p>
@@ -2951,10 +2951,10 @@
         <w:tblLook w:val="04A0" w:firstRow="1" w:lastRow="0" w:firstColumn="1" w:lastColumn="0" w:noHBand="0" w:noVBand="1"/>
       </w:tblPr>
       <w:tblGrid>
-        <w:gridCol w:w="700"/>
-        <w:gridCol w:w="1100"/>
-        <w:gridCol w:w="2000"/>
-        <w:gridCol w:w="3106"/>
+        <w:gridCol w:w="950"/>
+        <w:gridCol w:w="1000"/>
+        <w:gridCol w:w="1900"/>
+        <w:gridCol w:w="3056"/>
         <w:gridCol w:w="2500"/>
       </w:tblGrid>
       <w:tr>
@@ -2964,7 +2964,7 @@
         </w:trPr>
         <w:tc>
           <w:tcPr>
-            <w:tcW w:w="700" w:type="dxa"/>
+            <w:tcW w:w="950" w:type="dxa"/>
             <w:tcBorders>
               <w:top w:val="single" w:sz="6" w:space="0" w:color="000000"/>
               <w:bottom w:val="single" w:sz="6" w:space="0" w:color="000000"/>
@@ -2991,7 +2991,7 @@
         </w:tc>
         <w:tc>
           <w:tcPr>
-            <w:tcW w:w="1100" w:type="dxa"/>
+            <w:tcW w:w="1000" w:type="dxa"/>
             <w:tcBorders>
               <w:top w:val="single" w:sz="6" w:space="0" w:color="000000"/>
               <w:bottom w:val="single" w:sz="6" w:space="0" w:color="000000"/>
@@ -3018,7 +3018,7 @@
         </w:tc>
         <w:tc>
           <w:tcPr>
-            <w:tcW w:w="2000" w:type="dxa"/>
+            <w:tcW w:w="1900" w:type="dxa"/>
             <w:tcBorders>
               <w:top w:val="single" w:sz="6" w:space="0" w:color="000000"/>
               <w:bottom w:val="single" w:sz="6" w:space="0" w:color="000000"/>
@@ -3045,7 +3045,7 @@
         </w:tc>
         <w:tc>
           <w:tcPr>
-            <w:tcW w:w="3106" w:type="dxa"/>
+            <w:tcW w:w="3056" w:type="dxa"/>
             <w:tcBorders>
               <w:top w:val="single" w:sz="6" w:space="0" w:color="000000"/>
               <w:bottom w:val="single" w:sz="6" w:space="0" w:color="000000"/>
@@ -3104,7 +3104,7 @@
         </w:trPr>
         <w:tc>
           <w:tcPr>
-            <w:tcW w:w="700" w:type="dxa"/>
+            <w:tcW w:w="950" w:type="dxa"/>
           </w:tcPr>
           <w:p>
             <w:pPr>
@@ -3126,7 +3126,7 @@
         </w:tc>
         <w:tc>
           <w:tcPr>
-            <w:tcW w:w="1100" w:type="dxa"/>
+            <w:tcW w:w="1000" w:type="dxa"/>
           </w:tcPr>
           <w:p>
             <w:pPr>
@@ -3148,7 +3148,7 @@
         </w:tc>
         <w:tc>
           <w:tcPr>
-            <w:tcW w:w="2000" w:type="dxa"/>
+            <w:tcW w:w="1900" w:type="dxa"/>
           </w:tcPr>
           <w:p>
             <w:pPr>
@@ -3166,7 +3166,7 @@
         </w:tc>
         <w:tc>
           <w:tcPr>
-            <w:tcW w:w="3106" w:type="dxa"/>
+            <w:tcW w:w="3056" w:type="dxa"/>
           </w:tcPr>
           <w:p>
             <w:pPr>
@@ -3215,7 +3215,7 @@
         </w:trPr>
         <w:tc>
           <w:tcPr>
-            <w:tcW w:w="700" w:type="dxa"/>
+            <w:tcW w:w="950" w:type="dxa"/>
           </w:tcPr>
           <w:p>
             <w:pPr>
@@ -3237,7 +3237,7 @@
         </w:tc>
         <w:tc>
           <w:tcPr>
-            <w:tcW w:w="1100" w:type="dxa"/>
+            <w:tcW w:w="1000" w:type="dxa"/>
           </w:tcPr>
           <w:p>
             <w:pPr>
@@ -3259,7 +3259,7 @@
         </w:tc>
         <w:tc>
           <w:tcPr>
-            <w:tcW w:w="2000" w:type="dxa"/>
+            <w:tcW w:w="1900" w:type="dxa"/>
           </w:tcPr>
           <w:p>
             <w:pPr>
@@ -3281,7 +3281,7 @@
         </w:tc>
         <w:tc>
           <w:tcPr>
-            <w:tcW w:w="3106" w:type="dxa"/>
+            <w:tcW w:w="3056" w:type="dxa"/>
           </w:tcPr>
           <w:p>
             <w:pPr>
@@ -3330,7 +3330,7 @@
         </w:trPr>
         <w:tc>
           <w:tcPr>
-            <w:tcW w:w="700" w:type="dxa"/>
+            <w:tcW w:w="950" w:type="dxa"/>
           </w:tcPr>
           <w:p>
             <w:pPr>
@@ -3352,7 +3352,7 @@
         </w:tc>
         <w:tc>
           <w:tcPr>
-            <w:tcW w:w="1100" w:type="dxa"/>
+            <w:tcW w:w="1000" w:type="dxa"/>
           </w:tcPr>
           <w:p>
             <w:pPr>
@@ -3374,7 +3374,7 @@
         </w:tc>
         <w:tc>
           <w:tcPr>
-            <w:tcW w:w="2000" w:type="dxa"/>
+            <w:tcW w:w="1900" w:type="dxa"/>
           </w:tcPr>
           <w:p>
             <w:pPr>
@@ -3396,7 +3396,7 @@
         </w:tc>
         <w:tc>
           <w:tcPr>
-            <w:tcW w:w="3106" w:type="dxa"/>
+            <w:tcW w:w="3056" w:type="dxa"/>
           </w:tcPr>
           <w:p>
             <w:pPr>
@@ -3445,7 +3445,7 @@
         </w:trPr>
         <w:tc>
           <w:tcPr>
-            <w:tcW w:w="700" w:type="dxa"/>
+            <w:tcW w:w="950" w:type="dxa"/>
           </w:tcPr>
           <w:p>
             <w:pPr>
@@ -3467,7 +3467,7 @@
         </w:tc>
         <w:tc>
           <w:tcPr>
-            <w:tcW w:w="1100" w:type="dxa"/>
+            <w:tcW w:w="1000" w:type="dxa"/>
           </w:tcPr>
           <w:p>
             <w:pPr>
@@ -3489,7 +3489,7 @@
         </w:tc>
         <w:tc>
           <w:tcPr>
-            <w:tcW w:w="2000" w:type="dxa"/>
+            <w:tcW w:w="1900" w:type="dxa"/>
           </w:tcPr>
           <w:p>
             <w:pPr>
@@ -3511,7 +3511,7 @@
         </w:tc>
         <w:tc>
           <w:tcPr>
-            <w:tcW w:w="3106" w:type="dxa"/>
+            <w:tcW w:w="3056" w:type="dxa"/>
           </w:tcPr>
           <w:p>
             <w:pPr>
@@ -3560,7 +3560,7 @@
         </w:trPr>
         <w:tc>
           <w:tcPr>
-            <w:tcW w:w="700" w:type="dxa"/>
+            <w:tcW w:w="950" w:type="dxa"/>
           </w:tcPr>
           <w:p>
             <w:pPr>
@@ -3582,7 +3582,7 @@
         </w:tc>
         <w:tc>
           <w:tcPr>
-            <w:tcW w:w="1100" w:type="dxa"/>
+            <w:tcW w:w="1000" w:type="dxa"/>
           </w:tcPr>
           <w:p>
             <w:pPr>
@@ -3604,7 +3604,7 @@
         </w:tc>
         <w:tc>
           <w:tcPr>
-            <w:tcW w:w="2000" w:type="dxa"/>
+            <w:tcW w:w="1900" w:type="dxa"/>
           </w:tcPr>
           <w:p>
             <w:pPr>
@@ -3626,7 +3626,7 @@
         </w:tc>
         <w:tc>
           <w:tcPr>
-            <w:tcW w:w="3106" w:type="dxa"/>
+            <w:tcW w:w="3056" w:type="dxa"/>
           </w:tcPr>
           <w:p>
             <w:pPr>
@@ -3675,7 +3675,7 @@
         </w:trPr>
         <w:tc>
           <w:tcPr>
-            <w:tcW w:w="700" w:type="dxa"/>
+            <w:tcW w:w="950" w:type="dxa"/>
           </w:tcPr>
           <w:p>
             <w:pPr>
@@ -3697,7 +3697,7 @@
         </w:tc>
         <w:tc>
           <w:tcPr>
-            <w:tcW w:w="1100" w:type="dxa"/>
+            <w:tcW w:w="1000" w:type="dxa"/>
           </w:tcPr>
           <w:p>
             <w:pPr>
@@ -3719,7 +3719,7 @@
         </w:tc>
         <w:tc>
           <w:tcPr>
-            <w:tcW w:w="2000" w:type="dxa"/>
+            <w:tcW w:w="1900" w:type="dxa"/>
           </w:tcPr>
           <w:p>
             <w:pPr>
@@ -3741,7 +3741,7 @@
         </w:tc>
         <w:tc>
           <w:tcPr>
-            <w:tcW w:w="3106" w:type="dxa"/>
+            <w:tcW w:w="3056" w:type="dxa"/>
           </w:tcPr>
           <w:p>
             <w:pPr>
@@ -3782,7 +3782,7 @@
         </w:trPr>
         <w:tc>
           <w:tcPr>
-            <w:tcW w:w="700" w:type="dxa"/>
+            <w:tcW w:w="950" w:type="dxa"/>
           </w:tcPr>
           <w:p>
             <w:pPr>
@@ -3804,7 +3804,7 @@
         </w:tc>
         <w:tc>
           <w:tcPr>
-            <w:tcW w:w="1100" w:type="dxa"/>
+            <w:tcW w:w="1000" w:type="dxa"/>
           </w:tcPr>
           <w:p>
             <w:pPr>
@@ -3826,7 +3826,7 @@
         </w:tc>
         <w:tc>
           <w:tcPr>
-            <w:tcW w:w="2000" w:type="dxa"/>
+            <w:tcW w:w="1900" w:type="dxa"/>
           </w:tcPr>
           <w:p>
             <w:pPr>
@@ -3848,7 +3848,7 @@
         </w:tc>
         <w:tc>
           <w:tcPr>
-            <w:tcW w:w="3106" w:type="dxa"/>
+            <w:tcW w:w="3056" w:type="dxa"/>
           </w:tcPr>
           <w:p>
             <w:pPr>
@@ -3897,7 +3897,7 @@
         </w:trPr>
         <w:tc>
           <w:tcPr>
-            <w:tcW w:w="700" w:type="dxa"/>
+            <w:tcW w:w="950" w:type="dxa"/>
           </w:tcPr>
           <w:p>
             <w:pPr>
@@ -3919,7 +3919,7 @@
         </w:tc>
         <w:tc>
           <w:tcPr>
-            <w:tcW w:w="1100" w:type="dxa"/>
+            <w:tcW w:w="1000" w:type="dxa"/>
           </w:tcPr>
           <w:p>
             <w:pPr>
@@ -3941,7 +3941,7 @@
         </w:tc>
         <w:tc>
           <w:tcPr>
-            <w:tcW w:w="2000" w:type="dxa"/>
+            <w:tcW w:w="1900" w:type="dxa"/>
           </w:tcPr>
           <w:p>
             <w:pPr>
@@ -3963,7 +3963,7 @@
         </w:tc>
         <w:tc>
           <w:tcPr>
-            <w:tcW w:w="3106" w:type="dxa"/>
+            <w:tcW w:w="3056" w:type="dxa"/>
           </w:tcPr>
           <w:p>
             <w:pPr>
@@ -4012,7 +4012,7 @@
         </w:trPr>
         <w:tc>
           <w:tcPr>
-            <w:tcW w:w="700" w:type="dxa"/>
+            <w:tcW w:w="950" w:type="dxa"/>
           </w:tcPr>
           <w:p>
             <w:pPr>
@@ -4035,7 +4035,7 @@
         </w:tc>
         <w:tc>
           <w:tcPr>
-            <w:tcW w:w="1100" w:type="dxa"/>
+            <w:tcW w:w="1000" w:type="dxa"/>
           </w:tcPr>
           <w:p>
             <w:pPr>
@@ -4057,7 +4057,7 @@
         </w:tc>
         <w:tc>
           <w:tcPr>
-            <w:tcW w:w="2000" w:type="dxa"/>
+            <w:tcW w:w="1900" w:type="dxa"/>
           </w:tcPr>
           <w:p>
             <w:pPr>
@@ -4079,7 +4079,7 @@
         </w:tc>
         <w:tc>
           <w:tcPr>
-            <w:tcW w:w="3106" w:type="dxa"/>
+            <w:tcW w:w="3056" w:type="dxa"/>
           </w:tcPr>
           <w:p>
             <w:pPr>
@@ -4128,7 +4128,7 @@
         </w:trPr>
         <w:tc>
           <w:tcPr>
-            <w:tcW w:w="700" w:type="dxa"/>
+            <w:tcW w:w="950" w:type="dxa"/>
           </w:tcPr>
           <w:p>
             <w:pPr>
@@ -4150,7 +4150,7 @@
         </w:tc>
         <w:tc>
           <w:tcPr>
-            <w:tcW w:w="1100" w:type="dxa"/>
+            <w:tcW w:w="1000" w:type="dxa"/>
           </w:tcPr>
           <w:p>
             <w:pPr>
@@ -4172,7 +4172,7 @@
         </w:tc>
         <w:tc>
           <w:tcPr>
-            <w:tcW w:w="2000" w:type="dxa"/>
+            <w:tcW w:w="1900" w:type="dxa"/>
           </w:tcPr>
           <w:p>
             <w:pPr>
@@ -4194,7 +4194,7 @@
         </w:tc>
         <w:tc>
           <w:tcPr>
-            <w:tcW w:w="3106" w:type="dxa"/>
+            <w:tcW w:w="3056" w:type="dxa"/>
           </w:tcPr>
           <w:p>
             <w:pPr>
@@ -4243,7 +4243,7 @@
         </w:trPr>
         <w:tc>
           <w:tcPr>
-            <w:tcW w:w="700" w:type="dxa"/>
+            <w:tcW w:w="950" w:type="dxa"/>
           </w:tcPr>
           <w:p>
             <w:pPr>
@@ -4265,7 +4265,7 @@
         </w:tc>
         <w:tc>
           <w:tcPr>
-            <w:tcW w:w="1100" w:type="dxa"/>
+            <w:tcW w:w="1000" w:type="dxa"/>
           </w:tcPr>
           <w:p>
             <w:pPr>
@@ -4287,7 +4287,7 @@
         </w:tc>
         <w:tc>
           <w:tcPr>
-            <w:tcW w:w="2000" w:type="dxa"/>
+            <w:tcW w:w="1900" w:type="dxa"/>
           </w:tcPr>
           <w:p>
             <w:pPr>
@@ -4309,7 +4309,7 @@
         </w:tc>
         <w:tc>
           <w:tcPr>
-            <w:tcW w:w="3106" w:type="dxa"/>
+            <w:tcW w:w="3056" w:type="dxa"/>
           </w:tcPr>
           <w:p>
             <w:pPr>
@@ -4358,7 +4358,7 @@
         </w:trPr>
         <w:tc>
           <w:tcPr>
-            <w:tcW w:w="700" w:type="dxa"/>
+            <w:tcW w:w="950" w:type="dxa"/>
             <w:tcBorders>
               <w:bottom w:val="single" w:sz="6" w:space="0" w:color="000000"/>
             </w:tcBorders>
@@ -4383,7 +4383,7 @@
         </w:tc>
         <w:tc>
           <w:tcPr>
-            <w:tcW w:w="1100" w:type="dxa"/>
+            <w:tcW w:w="1000" w:type="dxa"/>
             <w:tcBorders>
               <w:bottom w:val="single" w:sz="6" w:space="0" w:color="000000"/>
             </w:tcBorders>
@@ -4408,7 +4408,7 @@
         </w:tc>
         <w:tc>
           <w:tcPr>
-            <w:tcW w:w="2000" w:type="dxa"/>
+            <w:tcW w:w="1900" w:type="dxa"/>
             <w:tcBorders>
               <w:bottom w:val="single" w:sz="6" w:space="0" w:color="000000"/>
             </w:tcBorders>
@@ -4433,7 +4433,7 @@
         </w:tc>
         <w:tc>
           <w:tcPr>
-            <w:tcW w:w="3106" w:type="dxa"/>
+            <w:tcW w:w="3056" w:type="dxa"/>
             <w:tcBorders>
               <w:bottom w:val="single" w:sz="6" w:space="0" w:color="000000"/>
             </w:tcBorders>
@@ -5537,12 +5537,12 @@
         <w:tblLook w:val="04A0" w:firstRow="1" w:lastRow="0" w:firstColumn="1" w:lastColumn="0" w:noHBand="0" w:noVBand="1"/>
       </w:tblPr>
       <w:tblGrid>
-        <w:gridCol w:w="700"/>
-        <w:gridCol w:w="4000"/>
-        <w:gridCol w:w="1400"/>
-        <w:gridCol w:w="1100"/>
-        <w:gridCol w:w="900"/>
-        <w:gridCol w:w="1306"/>
+        <w:gridCol w:w="650"/>
+        <w:gridCol w:w="3700"/>
+        <w:gridCol w:w="1300"/>
+        <w:gridCol w:w="1200"/>
+        <w:gridCol w:w="1000"/>
+        <w:gridCol w:w="1556"/>
       </w:tblGrid>
       <w:tr>
         <w:trPr>
@@ -5551,7 +5551,7 @@
         </w:trPr>
         <w:tc>
           <w:tcPr>
-            <w:tcW w:w="700" w:type="dxa"/>
+            <w:tcW w:w="650" w:type="dxa"/>
             <w:tcBorders>
               <w:top w:val="single" w:sz="6" w:space="0" w:color="000000"/>
               <w:bottom w:val="single" w:sz="6" w:space="0" w:color="000000"/>
@@ -5578,7 +5578,7 @@
         </w:tc>
         <w:tc>
           <w:tcPr>
-            <w:tcW w:w="4000" w:type="dxa"/>
+            <w:tcW w:w="3700" w:type="dxa"/>
             <w:tcBorders>
               <w:top w:val="single" w:sz="6" w:space="0" w:color="000000"/>
               <w:bottom w:val="single" w:sz="6" w:space="0" w:color="000000"/>
@@ -5605,7 +5605,7 @@
         </w:tc>
         <w:tc>
           <w:tcPr>
-            <w:tcW w:w="1400" w:type="dxa"/>
+            <w:tcW w:w="1300" w:type="dxa"/>
             <w:tcBorders>
               <w:top w:val="single" w:sz="6" w:space="0" w:color="000000"/>
               <w:bottom w:val="single" w:sz="6" w:space="0" w:color="000000"/>
@@ -5632,7 +5632,7 @@
         </w:tc>
         <w:tc>
           <w:tcPr>
-            <w:tcW w:w="1100" w:type="dxa"/>
+            <w:tcW w:w="1200" w:type="dxa"/>
             <w:tcBorders>
               <w:top w:val="single" w:sz="6" w:space="0" w:color="000000"/>
               <w:bottom w:val="single" w:sz="6" w:space="0" w:color="000000"/>
@@ -5659,7 +5659,7 @@
         </w:tc>
         <w:tc>
           <w:tcPr>
-            <w:tcW w:w="900" w:type="dxa"/>
+            <w:tcW w:w="1000" w:type="dxa"/>
             <w:tcBorders>
               <w:top w:val="single" w:sz="6" w:space="0" w:color="000000"/>
               <w:bottom w:val="single" w:sz="6" w:space="0" w:color="000000"/>
@@ -5686,7 +5686,7 @@
         </w:tc>
         <w:tc>
           <w:tcPr>
-            <w:tcW w:w="1306" w:type="dxa"/>
+            <w:tcW w:w="1556" w:type="dxa"/>
             <w:tcBorders>
               <w:top w:val="single" w:sz="6" w:space="0" w:color="000000"/>
               <w:bottom w:val="single" w:sz="6" w:space="0" w:color="000000"/>
@@ -5718,7 +5718,7 @@
         </w:trPr>
         <w:tc>
           <w:tcPr>
-            <w:tcW w:w="700" w:type="dxa"/>
+            <w:tcW w:w="650" w:type="dxa"/>
           </w:tcPr>
           <w:p>
             <w:pPr>
@@ -5740,7 +5740,7 @@
         </w:tc>
         <w:tc>
           <w:tcPr>
-            <w:tcW w:w="4000" w:type="dxa"/>
+            <w:tcW w:w="3700" w:type="dxa"/>
           </w:tcPr>
           <w:p>
             <w:pPr>
@@ -5762,7 +5762,7 @@
         </w:tc>
         <w:tc>
           <w:tcPr>
-            <w:tcW w:w="1400" w:type="dxa"/>
+            <w:tcW w:w="1300" w:type="dxa"/>
           </w:tcPr>
           <w:p>
             <w:pPr>
@@ -5784,7 +5784,7 @@
         </w:tc>
         <w:tc>
           <w:tcPr>
-            <w:tcW w:w="1100" w:type="dxa"/>
+            <w:tcW w:w="1200" w:type="dxa"/>
           </w:tcPr>
           <w:p>
             <w:pPr>
@@ -5806,7 +5806,7 @@
         </w:tc>
         <w:tc>
           <w:tcPr>
-            <w:tcW w:w="900" w:type="dxa"/>
+            <w:tcW w:w="1000" w:type="dxa"/>
           </w:tcPr>
           <w:p>
             <w:pPr>
@@ -5828,7 +5828,7 @@
         </w:tc>
         <w:tc>
           <w:tcPr>
-            <w:tcW w:w="1306" w:type="dxa"/>
+            <w:tcW w:w="1556" w:type="dxa"/>
           </w:tcPr>
           <w:p>
             <w:pPr>
@@ -5855,7 +5855,7 @@
         </w:trPr>
         <w:tc>
           <w:tcPr>
-            <w:tcW w:w="700" w:type="dxa"/>
+            <w:tcW w:w="650" w:type="dxa"/>
           </w:tcPr>
           <w:p>
             <w:pPr>
@@ -5877,7 +5877,7 @@
         </w:tc>
         <w:tc>
           <w:tcPr>
-            <w:tcW w:w="4000" w:type="dxa"/>
+            <w:tcW w:w="3700" w:type="dxa"/>
           </w:tcPr>
           <w:p>
             <w:pPr>
@@ -5899,7 +5899,7 @@
         </w:tc>
         <w:tc>
           <w:tcPr>
-            <w:tcW w:w="1400" w:type="dxa"/>
+            <w:tcW w:w="1300" w:type="dxa"/>
           </w:tcPr>
           <w:p>
             <w:pPr>
@@ -5921,7 +5921,7 @@
         </w:tc>
         <w:tc>
           <w:tcPr>
-            <w:tcW w:w="1100" w:type="dxa"/>
+            <w:tcW w:w="1200" w:type="dxa"/>
           </w:tcPr>
           <w:p>
             <w:pPr>
@@ -5943,7 +5943,7 @@
         </w:tc>
         <w:tc>
           <w:tcPr>
-            <w:tcW w:w="900" w:type="dxa"/>
+            <w:tcW w:w="1000" w:type="dxa"/>
           </w:tcPr>
           <w:p>
             <w:pPr>
@@ -5965,7 +5965,7 @@
         </w:tc>
         <w:tc>
           <w:tcPr>
-            <w:tcW w:w="1306" w:type="dxa"/>
+            <w:tcW w:w="1556" w:type="dxa"/>
           </w:tcPr>
           <w:p>
             <w:pPr>
@@ -5992,7 +5992,7 @@
         </w:trPr>
         <w:tc>
           <w:tcPr>
-            <w:tcW w:w="700" w:type="dxa"/>
+            <w:tcW w:w="650" w:type="dxa"/>
           </w:tcPr>
           <w:p>
             <w:pPr>
@@ -6014,7 +6014,7 @@
         </w:tc>
         <w:tc>
           <w:tcPr>
-            <w:tcW w:w="4000" w:type="dxa"/>
+            <w:tcW w:w="3700" w:type="dxa"/>
           </w:tcPr>
           <w:p>
             <w:pPr>
@@ -6036,7 +6036,7 @@
         </w:tc>
         <w:tc>
           <w:tcPr>
-            <w:tcW w:w="1400" w:type="dxa"/>
+            <w:tcW w:w="1300" w:type="dxa"/>
           </w:tcPr>
           <w:p>
             <w:pPr>
@@ -6058,7 +6058,7 @@
         </w:tc>
         <w:tc>
           <w:tcPr>
-            <w:tcW w:w="1100" w:type="dxa"/>
+            <w:tcW w:w="1200" w:type="dxa"/>
           </w:tcPr>
           <w:p>
             <w:pPr>
@@ -6080,7 +6080,7 @@
         </w:tc>
         <w:tc>
           <w:tcPr>
-            <w:tcW w:w="900" w:type="dxa"/>
+            <w:tcW w:w="1000" w:type="dxa"/>
           </w:tcPr>
           <w:p>
             <w:pPr>
@@ -6102,7 +6102,7 @@
         </w:tc>
         <w:tc>
           <w:tcPr>
-            <w:tcW w:w="1306" w:type="dxa"/>
+            <w:tcW w:w="1556" w:type="dxa"/>
           </w:tcPr>
           <w:p>
             <w:pPr>
@@ -6129,7 +6129,7 @@
         </w:trPr>
         <w:tc>
           <w:tcPr>
-            <w:tcW w:w="700" w:type="dxa"/>
+            <w:tcW w:w="650" w:type="dxa"/>
           </w:tcPr>
           <w:p>
             <w:pPr>
@@ -6151,7 +6151,7 @@
         </w:tc>
         <w:tc>
           <w:tcPr>
-            <w:tcW w:w="4000" w:type="dxa"/>
+            <w:tcW w:w="3700" w:type="dxa"/>
           </w:tcPr>
           <w:p>
             <w:pPr>
@@ -6173,7 +6173,7 @@
         </w:tc>
         <w:tc>
           <w:tcPr>
-            <w:tcW w:w="1400" w:type="dxa"/>
+            <w:tcW w:w="1300" w:type="dxa"/>
           </w:tcPr>
           <w:p>
             <w:pPr>
@@ -6195,7 +6195,7 @@
         </w:tc>
         <w:tc>
           <w:tcPr>
-            <w:tcW w:w="1100" w:type="dxa"/>
+            <w:tcW w:w="1200" w:type="dxa"/>
           </w:tcPr>
           <w:p>
             <w:pPr>
@@ -6217,7 +6217,7 @@
         </w:tc>
         <w:tc>
           <w:tcPr>
-            <w:tcW w:w="900" w:type="dxa"/>
+            <w:tcW w:w="1000" w:type="dxa"/>
           </w:tcPr>
           <w:p>
             <w:pPr>
@@ -6239,7 +6239,7 @@
         </w:tc>
         <w:tc>
           <w:tcPr>
-            <w:tcW w:w="1306" w:type="dxa"/>
+            <w:tcW w:w="1556" w:type="dxa"/>
           </w:tcPr>
           <w:p>
             <w:pPr>
@@ -6266,7 +6266,7 @@
         </w:trPr>
         <w:tc>
           <w:tcPr>
-            <w:tcW w:w="700" w:type="dxa"/>
+            <w:tcW w:w="650" w:type="dxa"/>
           </w:tcPr>
           <w:p>
             <w:pPr>
@@ -6288,7 +6288,7 @@
         </w:tc>
         <w:tc>
           <w:tcPr>
-            <w:tcW w:w="4000" w:type="dxa"/>
+            <w:tcW w:w="3700" w:type="dxa"/>
           </w:tcPr>
           <w:p>
             <w:pPr>
@@ -6310,7 +6310,7 @@
         </w:tc>
         <w:tc>
           <w:tcPr>
-            <w:tcW w:w="1400" w:type="dxa"/>
+            <w:tcW w:w="1300" w:type="dxa"/>
           </w:tcPr>
           <w:p>
             <w:pPr>
@@ -6332,7 +6332,7 @@
         </w:tc>
         <w:tc>
           <w:tcPr>
-            <w:tcW w:w="1100" w:type="dxa"/>
+            <w:tcW w:w="1200" w:type="dxa"/>
           </w:tcPr>
           <w:p>
             <w:pPr>
@@ -6354,7 +6354,7 @@
         </w:tc>
         <w:tc>
           <w:tcPr>
-            <w:tcW w:w="900" w:type="dxa"/>
+            <w:tcW w:w="1000" w:type="dxa"/>
           </w:tcPr>
           <w:p>
             <w:pPr>
@@ -6376,7 +6376,7 @@
         </w:tc>
         <w:tc>
           <w:tcPr>
-            <w:tcW w:w="1306" w:type="dxa"/>
+            <w:tcW w:w="1556" w:type="dxa"/>
           </w:tcPr>
           <w:p>
             <w:pPr>
@@ -6403,7 +6403,7 @@
         </w:trPr>
         <w:tc>
           <w:tcPr>
-            <w:tcW w:w="700" w:type="dxa"/>
+            <w:tcW w:w="650" w:type="dxa"/>
           </w:tcPr>
           <w:p>
             <w:pPr>
@@ -6425,7 +6425,7 @@
         </w:tc>
         <w:tc>
           <w:tcPr>
-            <w:tcW w:w="4000" w:type="dxa"/>
+            <w:tcW w:w="3700" w:type="dxa"/>
           </w:tcPr>
           <w:p>
             <w:pPr>
@@ -6447,7 +6447,7 @@
         </w:tc>
         <w:tc>
           <w:tcPr>
-            <w:tcW w:w="1400" w:type="dxa"/>
+            <w:tcW w:w="1300" w:type="dxa"/>
           </w:tcPr>
           <w:p>
             <w:pPr>
@@ -6469,7 +6469,7 @@
         </w:tc>
         <w:tc>
           <w:tcPr>
-            <w:tcW w:w="1100" w:type="dxa"/>
+            <w:tcW w:w="1200" w:type="dxa"/>
           </w:tcPr>
           <w:p>
             <w:pPr>
@@ -6491,7 +6491,7 @@
         </w:tc>
         <w:tc>
           <w:tcPr>
-            <w:tcW w:w="900" w:type="dxa"/>
+            <w:tcW w:w="1000" w:type="dxa"/>
           </w:tcPr>
           <w:p>
             <w:pPr>
@@ -6513,7 +6513,7 @@
         </w:tc>
         <w:tc>
           <w:tcPr>
-            <w:tcW w:w="1306" w:type="dxa"/>
+            <w:tcW w:w="1556" w:type="dxa"/>
           </w:tcPr>
           <w:p>
             <w:pPr>
@@ -6540,7 +6540,7 @@
         </w:trPr>
         <w:tc>
           <w:tcPr>
-            <w:tcW w:w="700" w:type="dxa"/>
+            <w:tcW w:w="650" w:type="dxa"/>
           </w:tcPr>
           <w:p>
             <w:pPr>
@@ -6562,7 +6562,7 @@
         </w:tc>
         <w:tc>
           <w:tcPr>
-            <w:tcW w:w="4000" w:type="dxa"/>
+            <w:tcW w:w="3700" w:type="dxa"/>
           </w:tcPr>
           <w:p>
             <w:pPr>
@@ -6584,7 +6584,7 @@
         </w:tc>
         <w:tc>
           <w:tcPr>
-            <w:tcW w:w="1400" w:type="dxa"/>
+            <w:tcW w:w="1300" w:type="dxa"/>
           </w:tcPr>
           <w:p>
             <w:pPr>
@@ -6606,7 +6606,7 @@
         </w:tc>
         <w:tc>
           <w:tcPr>
-            <w:tcW w:w="1100" w:type="dxa"/>
+            <w:tcW w:w="1200" w:type="dxa"/>
           </w:tcPr>
           <w:p>
             <w:pPr>
@@ -6628,7 +6628,7 @@
         </w:tc>
         <w:tc>
           <w:tcPr>
-            <w:tcW w:w="900" w:type="dxa"/>
+            <w:tcW w:w="1000" w:type="dxa"/>
           </w:tcPr>
           <w:p>
             <w:pPr>
@@ -6650,7 +6650,7 @@
         </w:tc>
         <w:tc>
           <w:tcPr>
-            <w:tcW w:w="1306" w:type="dxa"/>
+            <w:tcW w:w="1556" w:type="dxa"/>
           </w:tcPr>
           <w:p>
             <w:pPr>
@@ -6677,7 +6677,7 @@
         </w:trPr>
         <w:tc>
           <w:tcPr>
-            <w:tcW w:w="700" w:type="dxa"/>
+            <w:tcW w:w="650" w:type="dxa"/>
           </w:tcPr>
           <w:p>
             <w:pPr>
@@ -6699,7 +6699,7 @@
         </w:tc>
         <w:tc>
           <w:tcPr>
-            <w:tcW w:w="4000" w:type="dxa"/>
+            <w:tcW w:w="3700" w:type="dxa"/>
           </w:tcPr>
           <w:p>
             <w:pPr>
@@ -6721,7 +6721,7 @@
         </w:tc>
         <w:tc>
           <w:tcPr>
-            <w:tcW w:w="1400" w:type="dxa"/>
+            <w:tcW w:w="1300" w:type="dxa"/>
           </w:tcPr>
           <w:p>
             <w:pPr>
@@ -6743,7 +6743,7 @@
         </w:tc>
         <w:tc>
           <w:tcPr>
-            <w:tcW w:w="1100" w:type="dxa"/>
+            <w:tcW w:w="1200" w:type="dxa"/>
           </w:tcPr>
           <w:p>
             <w:pPr>
@@ -6765,7 +6765,7 @@
         </w:tc>
         <w:tc>
           <w:tcPr>
-            <w:tcW w:w="900" w:type="dxa"/>
+            <w:tcW w:w="1000" w:type="dxa"/>
           </w:tcPr>
           <w:p>
             <w:pPr>
@@ -6787,7 +6787,7 @@
         </w:tc>
         <w:tc>
           <w:tcPr>
-            <w:tcW w:w="1306" w:type="dxa"/>
+            <w:tcW w:w="1556" w:type="dxa"/>
           </w:tcPr>
           <w:p>
             <w:pPr>
@@ -6814,7 +6814,7 @@
         </w:trPr>
         <w:tc>
           <w:tcPr>
-            <w:tcW w:w="700" w:type="dxa"/>
+            <w:tcW w:w="650" w:type="dxa"/>
           </w:tcPr>
           <w:p>
             <w:pPr>
@@ -6837,7 +6837,7 @@
         </w:tc>
         <w:tc>
           <w:tcPr>
-            <w:tcW w:w="4000" w:type="dxa"/>
+            <w:tcW w:w="3700" w:type="dxa"/>
           </w:tcPr>
           <w:p>
             <w:pPr>
@@ -6859,7 +6859,7 @@
         </w:tc>
         <w:tc>
           <w:tcPr>
-            <w:tcW w:w="1400" w:type="dxa"/>
+            <w:tcW w:w="1300" w:type="dxa"/>
           </w:tcPr>
           <w:p>
             <w:pPr>
@@ -6881,7 +6881,7 @@
         </w:tc>
         <w:tc>
           <w:tcPr>
-            <w:tcW w:w="1100" w:type="dxa"/>
+            <w:tcW w:w="1200" w:type="dxa"/>
           </w:tcPr>
           <w:p>
             <w:pPr>
@@ -6903,7 +6903,7 @@
         </w:tc>
         <w:tc>
           <w:tcPr>
-            <w:tcW w:w="900" w:type="dxa"/>
+            <w:tcW w:w="1000" w:type="dxa"/>
           </w:tcPr>
           <w:p>
             <w:pPr>
@@ -6925,7 +6925,7 @@
         </w:tc>
         <w:tc>
           <w:tcPr>
-            <w:tcW w:w="1306" w:type="dxa"/>
+            <w:tcW w:w="1556" w:type="dxa"/>
           </w:tcPr>
           <w:p>
             <w:pPr>
@@ -6952,7 +6952,7 @@
         </w:trPr>
         <w:tc>
           <w:tcPr>
-            <w:tcW w:w="700" w:type="dxa"/>
+            <w:tcW w:w="650" w:type="dxa"/>
           </w:tcPr>
           <w:p>
             <w:pPr>
@@ -6974,7 +6974,7 @@
         </w:tc>
         <w:tc>
           <w:tcPr>
-            <w:tcW w:w="4000" w:type="dxa"/>
+            <w:tcW w:w="3700" w:type="dxa"/>
           </w:tcPr>
           <w:p>
             <w:pPr>
@@ -6996,7 +6996,7 @@
         </w:tc>
         <w:tc>
           <w:tcPr>
-            <w:tcW w:w="1400" w:type="dxa"/>
+            <w:tcW w:w="1300" w:type="dxa"/>
           </w:tcPr>
           <w:p>
             <w:pPr>
@@ -7018,7 +7018,7 @@
         </w:tc>
         <w:tc>
           <w:tcPr>
-            <w:tcW w:w="1100" w:type="dxa"/>
+            <w:tcW w:w="1200" w:type="dxa"/>
           </w:tcPr>
           <w:p>
             <w:pPr>
@@ -7040,7 +7040,7 @@
         </w:tc>
         <w:tc>
           <w:tcPr>
-            <w:tcW w:w="900" w:type="dxa"/>
+            <w:tcW w:w="1000" w:type="dxa"/>
           </w:tcPr>
           <w:p>
             <w:pPr>
@@ -7062,7 +7062,7 @@
         </w:tc>
         <w:tc>
           <w:tcPr>
-            <w:tcW w:w="1306" w:type="dxa"/>
+            <w:tcW w:w="1556" w:type="dxa"/>
           </w:tcPr>
           <w:p>
             <w:pPr>
@@ -7089,7 +7089,7 @@
         </w:trPr>
         <w:tc>
           <w:tcPr>
-            <w:tcW w:w="700" w:type="dxa"/>
+            <w:tcW w:w="650" w:type="dxa"/>
           </w:tcPr>
           <w:p>
             <w:pPr>
@@ -7111,7 +7111,7 @@
         </w:tc>
         <w:tc>
           <w:tcPr>
-            <w:tcW w:w="4000" w:type="dxa"/>
+            <w:tcW w:w="3700" w:type="dxa"/>
           </w:tcPr>
           <w:p>
             <w:pPr>
@@ -7133,7 +7133,7 @@
         </w:tc>
         <w:tc>
           <w:tcPr>
-            <w:tcW w:w="1400" w:type="dxa"/>
+            <w:tcW w:w="1300" w:type="dxa"/>
           </w:tcPr>
           <w:p>
             <w:pPr>
@@ -7155,7 +7155,7 @@
         </w:tc>
         <w:tc>
           <w:tcPr>
-            <w:tcW w:w="1100" w:type="dxa"/>
+            <w:tcW w:w="1200" w:type="dxa"/>
           </w:tcPr>
           <w:p>
             <w:pPr>
@@ -7177,7 +7177,7 @@
         </w:tc>
         <w:tc>
           <w:tcPr>
-            <w:tcW w:w="900" w:type="dxa"/>
+            <w:tcW w:w="1000" w:type="dxa"/>
           </w:tcPr>
           <w:p>
             <w:pPr>
@@ -7199,7 +7199,7 @@
         </w:tc>
         <w:tc>
           <w:tcPr>
-            <w:tcW w:w="1306" w:type="dxa"/>
+            <w:tcW w:w="1556" w:type="dxa"/>
           </w:tcPr>
           <w:p>
             <w:pPr>
@@ -7226,7 +7226,7 @@
         </w:trPr>
         <w:tc>
           <w:tcPr>
-            <w:tcW w:w="700" w:type="dxa"/>
+            <w:tcW w:w="650" w:type="dxa"/>
           </w:tcPr>
           <w:p>
             <w:pPr>
@@ -7248,7 +7248,7 @@
         </w:tc>
         <w:tc>
           <w:tcPr>
-            <w:tcW w:w="4000" w:type="dxa"/>
+            <w:tcW w:w="3700" w:type="dxa"/>
           </w:tcPr>
           <w:p>
             <w:pPr>
@@ -7270,7 +7270,7 @@
         </w:tc>
         <w:tc>
           <w:tcPr>
-            <w:tcW w:w="1400" w:type="dxa"/>
+            <w:tcW w:w="1300" w:type="dxa"/>
           </w:tcPr>
           <w:p>
             <w:pPr>
@@ -7292,7 +7292,7 @@
         </w:tc>
         <w:tc>
           <w:tcPr>
-            <w:tcW w:w="1100" w:type="dxa"/>
+            <w:tcW w:w="1200" w:type="dxa"/>
           </w:tcPr>
           <w:p>
             <w:pPr>
@@ -7314,7 +7314,7 @@
         </w:tc>
         <w:tc>
           <w:tcPr>
-            <w:tcW w:w="900" w:type="dxa"/>
+            <w:tcW w:w="1000" w:type="dxa"/>
           </w:tcPr>
           <w:p>
             <w:pPr>
@@ -7336,7 +7336,7 @@
         </w:tc>
         <w:tc>
           <w:tcPr>
-            <w:tcW w:w="1306" w:type="dxa"/>
+            <w:tcW w:w="1556" w:type="dxa"/>
           </w:tcPr>
           <w:p>
             <w:pPr>
@@ -7363,7 +7363,7 @@
         </w:trPr>
         <w:tc>
           <w:tcPr>
-            <w:tcW w:w="700" w:type="dxa"/>
+            <w:tcW w:w="650" w:type="dxa"/>
             <w:tcBorders>
               <w:bottom w:val="single" w:sz="6" w:space="0" w:color="000000"/>
             </w:tcBorders>
@@ -7388,7 +7388,7 @@
         </w:tc>
         <w:tc>
           <w:tcPr>
-            <w:tcW w:w="4000" w:type="dxa"/>
+            <w:tcW w:w="3700" w:type="dxa"/>
             <w:tcBorders>
               <w:bottom w:val="single" w:sz="6" w:space="0" w:color="000000"/>
             </w:tcBorders>
@@ -7413,7 +7413,7 @@
         </w:tc>
         <w:tc>
           <w:tcPr>
-            <w:tcW w:w="1400" w:type="dxa"/>
+            <w:tcW w:w="1300" w:type="dxa"/>
             <w:tcBorders>
               <w:bottom w:val="single" w:sz="6" w:space="0" w:color="000000"/>
             </w:tcBorders>
@@ -7438,7 +7438,7 @@
         </w:tc>
         <w:tc>
           <w:tcPr>
-            <w:tcW w:w="1100" w:type="dxa"/>
+            <w:tcW w:w="1200" w:type="dxa"/>
             <w:tcBorders>
               <w:bottom w:val="single" w:sz="6" w:space="0" w:color="000000"/>
             </w:tcBorders>
@@ -7463,7 +7463,7 @@
         </w:tc>
         <w:tc>
           <w:tcPr>
-            <w:tcW w:w="900" w:type="dxa"/>
+            <w:tcW w:w="1000" w:type="dxa"/>
             <w:tcBorders>
               <w:bottom w:val="single" w:sz="6" w:space="0" w:color="000000"/>
             </w:tcBorders>
@@ -7488,7 +7488,7 @@
         </w:tc>
         <w:tc>
           <w:tcPr>
-            <w:tcW w:w="1306" w:type="dxa"/>
+            <w:tcW w:w="1556" w:type="dxa"/>
             <w:tcBorders>
               <w:bottom w:val="single" w:sz="6" w:space="0" w:color="000000"/>
             </w:tcBorders>
@@ -8054,8 +8054,8 @@
         <w:tblLook w:val="04A0" w:firstRow="1" w:lastRow="0" w:firstColumn="1" w:lastColumn="0" w:noHBand="0" w:noVBand="1"/>
       </w:tblPr>
       <w:tblGrid>
-        <w:gridCol w:w="900"/>
-        <w:gridCol w:w="3300"/>
+        <w:gridCol w:w="1000"/>
+        <w:gridCol w:w="3200"/>
         <w:gridCol w:w="2000"/>
         <w:gridCol w:w="3206"/>
       </w:tblGrid>
@@ -8066,7 +8066,7 @@
         </w:trPr>
         <w:tc>
           <w:tcPr>
-            <w:tcW w:w="900" w:type="dxa"/>
+            <w:tcW w:w="1000" w:type="dxa"/>
             <w:tcBorders>
               <w:top w:val="single" w:sz="6" w:space="0" w:color="000000"/>
               <w:bottom w:val="single" w:sz="6" w:space="0" w:color="000000"/>
@@ -8093,7 +8093,7 @@
         </w:tc>
         <w:tc>
           <w:tcPr>
-            <w:tcW w:w="3300" w:type="dxa"/>
+            <w:tcW w:w="3200" w:type="dxa"/>
             <w:tcBorders>
               <w:top w:val="single" w:sz="6" w:space="0" w:color="000000"/>
               <w:bottom w:val="single" w:sz="6" w:space="0" w:color="000000"/>
@@ -8179,7 +8179,7 @@
         </w:trPr>
         <w:tc>
           <w:tcPr>
-            <w:tcW w:w="900" w:type="dxa"/>
+            <w:tcW w:w="1000" w:type="dxa"/>
           </w:tcPr>
           <w:p>
             <w:pPr>
@@ -8201,7 +8201,7 @@
         </w:tc>
         <w:tc>
           <w:tcPr>
-            <w:tcW w:w="3300" w:type="dxa"/>
+            <w:tcW w:w="3200" w:type="dxa"/>
           </w:tcPr>
           <w:p>
             <w:pPr>
@@ -8272,7 +8272,7 @@
         </w:trPr>
         <w:tc>
           <w:tcPr>
-            <w:tcW w:w="900" w:type="dxa"/>
+            <w:tcW w:w="1000" w:type="dxa"/>
           </w:tcPr>
           <w:p>
             <w:pPr>
@@ -8294,7 +8294,7 @@
         </w:tc>
         <w:tc>
           <w:tcPr>
-            <w:tcW w:w="3300" w:type="dxa"/>
+            <w:tcW w:w="3200" w:type="dxa"/>
           </w:tcPr>
           <w:p>
             <w:pPr>
@@ -8365,7 +8365,7 @@
         </w:trPr>
         <w:tc>
           <w:tcPr>
-            <w:tcW w:w="900" w:type="dxa"/>
+            <w:tcW w:w="1000" w:type="dxa"/>
             <w:tcBorders>
               <w:bottom w:val="single" w:sz="6" w:space="0" w:color="000000"/>
             </w:tcBorders>
@@ -8390,7 +8390,7 @@
         </w:tc>
         <w:tc>
           <w:tcPr>
-            <w:tcW w:w="3300" w:type="dxa"/>
+            <w:tcW w:w="3200" w:type="dxa"/>
             <w:tcBorders>
               <w:bottom w:val="single" w:sz="6" w:space="0" w:color="000000"/>
             </w:tcBorders>
@@ -30176,20 +30176,20 @@
         <w:rPr>
           <w:lang w:val="es-GT"/>
         </w:rPr>
-        <w:t xml:space="preserve">López Sajquin, M. R. (2026). </w:t>
+        <w:t xml:space="preserve">Dirección de Posgrados FISI, Universidad Mariano Gálvez de Guatemala. (2026). </w:t>
       </w:r>
       <w:r>
         <w:rPr>
           <w:i/>
           <w:lang w:val="es-GT"/>
         </w:rPr>
-        <w:t>Modelado de amenazas en el diseño: DFD, STRIDE, PASTA y priorización</w:t>
+        <w:t>Modelado de amenazas: STRIDE, DFD y priorización en la fase de diseño</w:t>
       </w:r>
       <w:r>
         <w:rPr>
           <w:lang w:val="es-GT"/>
         </w:rPr>
-        <w:t xml:space="preserve"> [Diapositivas de la semana 2]. Seguridad en Aplicaciones, Universidad Mariano Gálvez de Guatemala.</w:t>
+        <w:t xml:space="preserve"> [Diapositivas de la semana 2]. Seguridad en Aplicaciones (093-013), Maestría en Seguridad Informática.</w:t>
       </w:r>
     </w:p>
     <w:p>

</xml_diff>